<commit_message>
docs: enrich PROJECT_DOCUMENTATION (.docx and .md) with visual System Architecture diagram, ERD diagram, and Sequential Workflow State Transition diagram
</commit_message>
<xml_diff>
--- a/PROJECT_DOCUMENTATION.docx
+++ b/PROJECT_DOCUMENTATION.docx
@@ -10,28 +10,22 @@
         <w:rPr>
           <w:b/>
           <w:color w:val="1E1B4B"/>
-          <w:sz w:val="44"/>
+          <w:sz w:val="40"/>
         </w:rPr>
-        <w:t>CSE226 Foundations of Vibe Coding</w:t>
+        <w:t>CSE226 Final Project Technical Documentation</w:t>
         <w:br/>
-        <w:t>Final Project Documentation</w:t>
+      </w:r>
+      <w:r>
+        <w:rPr>
+          <w:b/>
+          <w:color w:val="4F46E5"/>
+          <w:sz w:val="23"/>
+        </w:rPr>
+        <w:t>Multi-Tenant Inter-Office Memo Management System</w:t>
+        <w:br/>
+        <w:t>Deterministic Sequential Approval Workflow Engine &amp; Document Governance SaaS</w:t>
       </w:r>
     </w:p>
-    <w:p>
-      <w:pPr>
-        <w:jc w:val="center"/>
-      </w:pPr>
-      <w:r>
-        <w:rPr>
-          <w:color w:val="4F46E5"/>
-          <w:sz w:val="26"/>
-        </w:rPr>
-        <w:t>Enterprise Multi-Tenant Inter-Office Memo Management System</w:t>
-        <w:br/>
-        <w:t>Deterministic Sequential Approval Workflow Engine &amp; Document Governance</w:t>
-      </w:r>
-    </w:p>
-    <w:p/>
     <w:tbl>
       <w:tblPr>
         <w:tblW w:type="auto" w:w="0"/>
@@ -39,20 +33,50 @@
         <w:tblLook w:firstColumn="1" w:firstRow="1" w:lastColumn="0" w:lastRow="0" w:noHBand="0" w:noVBand="1" w:val="04A0"/>
       </w:tblPr>
       <w:tblGrid>
-        <w:gridCol w:w="4680"/>
-        <w:gridCol w:w="4680"/>
+        <w:gridCol w:w="4968"/>
+        <w:gridCol w:w="4968"/>
       </w:tblGrid>
       <w:tr>
         <w:tc>
           <w:tcPr>
-            <w:tcW w:type="dxa" w:w="3168"/>
+            <w:tcW w:type="dxa" w:w="2880"/>
             <w:shd w:fill="F1F5F9"/>
           </w:tcPr>
           <w:p>
             <w:r>
               <w:rPr>
                 <w:b/>
-                <w:sz w:val="20"/>
+                <w:sz w:val="19"/>
+              </w:rPr>
+              <w:t>Author / Student:</w:t>
+            </w:r>
+          </w:p>
+        </w:tc>
+        <w:tc>
+          <w:tcPr>
+            <w:tcW w:type="dxa" w:w="6912"/>
+          </w:tcPr>
+          <w:p>
+            <w:r>
+              <w:rPr>
+                <w:sz w:val="19"/>
+              </w:rPr>
+              <w:t>Zaman Shafin (North South University)</w:t>
+            </w:r>
+          </w:p>
+        </w:tc>
+      </w:tr>
+      <w:tr>
+        <w:tc>
+          <w:tcPr>
+            <w:tcW w:type="dxa" w:w="2880"/>
+            <w:shd w:fill="F1F5F9"/>
+          </w:tcPr>
+          <w:p>
+            <w:r>
+              <w:rPr>
+                <w:b/>
+                <w:sz w:val="19"/>
               </w:rPr>
               <w:t>Course &amp; Term:</w:t>
             </w:r>
@@ -60,12 +84,12 @@
         </w:tc>
         <w:tc>
           <w:tcPr>
-            <w:tcW w:type="dxa" w:w="6192"/>
+            <w:tcW w:type="dxa" w:w="6912"/>
           </w:tcPr>
           <w:p>
             <w:r>
               <w:rPr>
-                <w:sz w:val="20"/>
+                <w:sz w:val="19"/>
               </w:rPr>
               <w:t>CSE226 Foundations of Vibe Coding — Summer 2026</w:t>
             </w:r>
@@ -75,87 +99,27 @@
       <w:tr>
         <w:tc>
           <w:tcPr>
-            <w:tcW w:type="dxa" w:w="3168"/>
+            <w:tcW w:type="dxa" w:w="2880"/>
             <w:shd w:fill="F1F5F9"/>
           </w:tcPr>
           <w:p>
             <w:r>
               <w:rPr>
                 <w:b/>
-                <w:sz w:val="20"/>
+                <w:sz w:val="19"/>
               </w:rPr>
-              <w:t>Institution:</w:t>
+              <w:t>Deployed System URL:</w:t>
             </w:r>
           </w:p>
         </w:tc>
         <w:tc>
           <w:tcPr>
-            <w:tcW w:type="dxa" w:w="6192"/>
+            <w:tcW w:type="dxa" w:w="6912"/>
           </w:tcPr>
           <w:p>
             <w:r>
               <w:rPr>
-                <w:sz w:val="20"/>
-              </w:rPr>
-              <w:t>North South University</w:t>
-            </w:r>
-          </w:p>
-        </w:tc>
-      </w:tr>
-      <w:tr>
-        <w:tc>
-          <w:tcPr>
-            <w:tcW w:type="dxa" w:w="3168"/>
-            <w:shd w:fill="F1F5F9"/>
-          </w:tcPr>
-          <w:p>
-            <w:r>
-              <w:rPr>
-                <w:b/>
-                <w:sz w:val="20"/>
-              </w:rPr>
-              <w:t>Student / Author:</w:t>
-            </w:r>
-          </w:p>
-        </w:tc>
-        <w:tc>
-          <w:tcPr>
-            <w:tcW w:type="dxa" w:w="6192"/>
-          </w:tcPr>
-          <w:p>
-            <w:r>
-              <w:rPr>
-                <w:sz w:val="20"/>
-              </w:rPr>
-              <w:t>Zaman Shafin</w:t>
-            </w:r>
-          </w:p>
-        </w:tc>
-      </w:tr>
-      <w:tr>
-        <w:tc>
-          <w:tcPr>
-            <w:tcW w:type="dxa" w:w="3168"/>
-            <w:shd w:fill="F1F5F9"/>
-          </w:tcPr>
-          <w:p>
-            <w:r>
-              <w:rPr>
-                <w:b/>
-                <w:sz w:val="20"/>
-              </w:rPr>
-              <w:t>Deployed Application URL:</w:t>
-            </w:r>
-          </w:p>
-        </w:tc>
-        <w:tc>
-          <w:tcPr>
-            <w:tcW w:type="dxa" w:w="6192"/>
-          </w:tcPr>
-          <w:p>
-            <w:r>
-              <w:rPr>
-                <w:sz w:val="20"/>
+                <w:sz w:val="19"/>
               </w:rPr>
               <w:t>https://memo-system-pjbj.vercel.app</w:t>
             </w:r>
@@ -165,29 +129,836 @@
       <w:tr>
         <w:tc>
           <w:tcPr>
-            <w:tcW w:type="dxa" w:w="3168"/>
+            <w:tcW w:type="dxa" w:w="2880"/>
             <w:shd w:fill="F1F5F9"/>
           </w:tcPr>
           <w:p>
             <w:r>
               <w:rPr>
                 <w:b/>
-                <w:sz w:val="20"/>
+                <w:sz w:val="19"/>
               </w:rPr>
-              <w:t>GitHub Repository &amp; Source:</w:t>
+              <w:t>Source Code Archive:</w:t>
             </w:r>
           </w:p>
         </w:tc>
         <w:tc>
           <w:tcPr>
-            <w:tcW w:type="dxa" w:w="6192"/>
+            <w:tcW w:type="dxa" w:w="6912"/>
           </w:tcPr>
           <w:p>
             <w:r>
               <w:rPr>
+                <w:sz w:val="19"/>
+              </w:rPr>
+              <w:t>https://github.com/ZamanShafin/memo-system/raw/main/source_code.zip</w:t>
+            </w:r>
+          </w:p>
+        </w:tc>
+      </w:tr>
+      <w:tr>
+        <w:tc>
+          <w:tcPr>
+            <w:tcW w:type="dxa" w:w="2880"/>
+            <w:shd w:fill="F1F5F9"/>
+          </w:tcPr>
+          <w:p>
+            <w:r>
+              <w:rPr>
+                <w:b/>
+                <w:sz w:val="19"/>
+              </w:rPr>
+              <w:t>GitHub Repository:</w:t>
+            </w:r>
+          </w:p>
+        </w:tc>
+        <w:tc>
+          <w:tcPr>
+            <w:tcW w:type="dxa" w:w="6912"/>
+          </w:tcPr>
+          <w:p>
+            <w:r>
+              <w:rPr>
+                <w:sz w:val="19"/>
+              </w:rPr>
+              <w:t>https://github.com/ZamanShafin/memo-system</w:t>
+            </w:r>
+          </w:p>
+        </w:tc>
+      </w:tr>
+    </w:tbl>
+    <w:p/>
+    <w:p>
+      <w:pPr>
+        <w:pStyle w:val="Heading1"/>
+      </w:pPr>
+      <w:r>
+        <w:t>1. System Overview &amp; Core Capabilities</w:t>
+      </w:r>
+    </w:p>
+    <w:p>
+      <w:r>
+        <w:t>The Inter-Office Memo Management System is a full-stack, multi-tenant SaaS application built to digitize, govern, and audit corporate memorandum workflows. It eliminates fragmented email threads and physical paper slips by enforcing deterministic sequential approvals, active delegation, immutable version history, and cryptographic PDF generation.</w:t>
+      </w:r>
+    </w:p>
+    <w:tbl>
+      <w:tblPr>
+        <w:tblW w:type="auto" w:w="0"/>
+        <w:jc w:val="center"/>
+        <w:tblLook w:firstColumn="1" w:firstRow="1" w:lastColumn="0" w:lastRow="0" w:noHBand="0" w:noVBand="1" w:val="04A0"/>
+      </w:tblPr>
+      <w:tblGrid>
+        <w:gridCol w:w="9936"/>
+      </w:tblGrid>
+      <w:tr>
+        <w:tc>
+          <w:tcPr>
+            <w:tcW w:type="dxa" w:w="9792"/>
+            <w:shd w:fill="F8FAFC"/>
+          </w:tcPr>
+          <w:p>
+            <w:pPr>
+              <w:spacing w:before="80" w:after="80"/>
+            </w:pPr>
+            <w:r>
+              <w:rPr>
+                <w:b/>
+                <w:color w:val="1E1B4B"/>
                 <w:sz w:val="20"/>
               </w:rPr>
-              <w:t>https://github.com/ZamanShafin/memo-system</w:t>
+              <w:t>Key System Highlights</w:t>
+              <w:br/>
+            </w:r>
+            <w:r>
+              <w:rPr>
+                <w:color w:val="334155"/>
+                <w:sz w:val="19"/>
+              </w:rPr>
+              <w:t>• Multi-Tenant Isolation: Logical data partitioning with non-nullable org_id scoping across every database query.</w:t>
+              <w:br/>
+              <w:t>• Strict Turn Governance: Memos execute sequentially (Requester -&gt; Dept Head -&gt; Finance -&gt; Director -&gt; CEO). Later participants are physically blocked from acting early.</w:t>
+              <w:br/>
+              <w:t>• Active Delegation: Temporary date-bounded approval authority handoffs when officers are on leave.</w:t>
+              <w:br/>
+              <w:t>• Dynamic Reviewer Injection: Approvers can dynamically insert specialized reviewers (e.g. Legal Counsel) mid-stream.</w:t>
+              <w:br/>
+              <w:t>• Tamper-Evident Auditing: Append-only audit logs with timestamps, actor IDs, comments, and client IPs.</w:t>
+              <w:br/>
+              <w:t>• PDF Seal Engine: Generates official corporate PDFs complete with digital signatures and QR verification codes.</w:t>
+            </w:r>
+          </w:p>
+        </w:tc>
+      </w:tr>
+    </w:tbl>
+    <w:p/>
+    <w:p>
+      <w:pPr>
+        <w:pStyle w:val="Heading1"/>
+      </w:pPr>
+      <w:r>
+        <w:t>2. Requirements Implemented (Compliance Matrix)</w:t>
+      </w:r>
+    </w:p>
+    <w:tbl>
+      <w:tblPr>
+        <w:tblW w:type="auto" w:w="0"/>
+        <w:jc w:val="center"/>
+        <w:tblLook w:firstColumn="1" w:firstRow="1" w:lastColumn="0" w:lastRow="0" w:noHBand="0" w:noVBand="1" w:val="04A0"/>
+      </w:tblPr>
+      <w:tblGrid>
+        <w:gridCol w:w="3312"/>
+        <w:gridCol w:w="3312"/>
+        <w:gridCol w:w="3312"/>
+      </w:tblGrid>
+      <w:tr>
+        <w:tc>
+          <w:tcPr>
+            <w:tcW w:type="dxa" w:w="3312"/>
+            <w:shd w:fill="1E1B4B"/>
+          </w:tcPr>
+          <w:p>
+            <w:r>
+              <w:rPr>
+                <w:b/>
+                <w:color w:val="FFFFFF"/>
+                <w:sz w:val="19"/>
+              </w:rPr>
+              <w:t>Ref #</w:t>
+            </w:r>
+          </w:p>
+        </w:tc>
+        <w:tc>
+          <w:tcPr>
+            <w:tcW w:type="dxa" w:w="3312"/>
+            <w:shd w:fill="1E1B4B"/>
+          </w:tcPr>
+          <w:p>
+            <w:r>
+              <w:rPr>
+                <w:b/>
+                <w:color w:val="FFFFFF"/>
+                <w:sz w:val="19"/>
+              </w:rPr>
+              <w:t>Requirement Area</w:t>
+            </w:r>
+          </w:p>
+        </w:tc>
+        <w:tc>
+          <w:tcPr>
+            <w:tcW w:type="dxa" w:w="3312"/>
+            <w:shd w:fill="1E1B4B"/>
+          </w:tcPr>
+          <w:p>
+            <w:r>
+              <w:rPr>
+                <w:b/>
+                <w:color w:val="FFFFFF"/>
+                <w:sz w:val="19"/>
+              </w:rPr>
+              <w:t>Implementation Highlights</w:t>
+            </w:r>
+          </w:p>
+        </w:tc>
+      </w:tr>
+      <w:tr>
+        <w:tc>
+          <w:tcPr>
+            <w:tcW w:type="dxa" w:w="3312"/>
+            <w:shd w:fill="F8FAFC"/>
+          </w:tcPr>
+          <w:p>
+            <w:r>
+              <w:rPr>
+                <w:sz w:val="18"/>
+              </w:rPr>
+              <w:t>Req 1-4</w:t>
+            </w:r>
+          </w:p>
+        </w:tc>
+        <w:tc>
+          <w:tcPr>
+            <w:tcW w:type="dxa" w:w="3312"/>
+            <w:shd w:fill="F8FAFC"/>
+          </w:tcPr>
+          <w:p>
+            <w:r>
+              <w:rPr>
+                <w:sz w:val="18"/>
+              </w:rPr>
+              <w:t>Multi-Tenancy &amp; RBAC</w:t>
+            </w:r>
+          </w:p>
+        </w:tc>
+        <w:tc>
+          <w:tcPr>
+            <w:tcW w:type="dxa" w:w="3312"/>
+            <w:shd w:fill="F8FAFC"/>
+          </w:tcPr>
+          <w:p>
+            <w:r>
+              <w:rPr>
+                <w:sz w:val="18"/>
+              </w:rPr>
+              <w:t>Complete org_id data perimeters, Admin/User roles, department management.</w:t>
+            </w:r>
+          </w:p>
+        </w:tc>
+      </w:tr>
+      <w:tr>
+        <w:tc>
+          <w:tcPr>
+            <w:tcW w:type="dxa" w:w="3312"/>
+          </w:tcPr>
+          <w:p>
+            <w:r>
+              <w:rPr>
+                <w:sz w:val="18"/>
+              </w:rPr>
+              <w:t>Req 5-7</w:t>
+            </w:r>
+          </w:p>
+        </w:tc>
+        <w:tc>
+          <w:tcPr>
+            <w:tcW w:type="dxa" w:w="3312"/>
+          </w:tcPr>
+          <w:p>
+            <w:r>
+              <w:rPr>
+                <w:sz w:val="18"/>
+              </w:rPr>
+              <w:t>Auth &amp; Memo Authoring</w:t>
+            </w:r>
+          </w:p>
+        </w:tc>
+        <w:tc>
+          <w:tcPr>
+            <w:tcW w:type="dxa" w:w="3312"/>
+          </w:tcPr>
+          <w:p>
+            <w:r>
+              <w:rPr>
+                <w:sz w:val="18"/>
+              </w:rPr>
+              <w:t>JWT tokens, password reset, Quill.js rich text editor, priority tags, file uploads.</w:t>
+            </w:r>
+          </w:p>
+        </w:tc>
+      </w:tr>
+      <w:tr>
+        <w:tc>
+          <w:tcPr>
+            <w:tcW w:type="dxa" w:w="3312"/>
+            <w:shd w:fill="F8FAFC"/>
+          </w:tcPr>
+          <w:p>
+            <w:r>
+              <w:rPr>
+                <w:sz w:val="18"/>
+              </w:rPr>
+              <w:t>Req 8-10</w:t>
+            </w:r>
+          </w:p>
+        </w:tc>
+        <w:tc>
+          <w:tcPr>
+            <w:tcW w:type="dxa" w:w="3312"/>
+            <w:shd w:fill="F8FAFC"/>
+          </w:tcPr>
+          <w:p>
+            <w:r>
+              <w:rPr>
+                <w:sz w:val="18"/>
+              </w:rPr>
+              <w:t>Sequential Workflow Engine</w:t>
+            </w:r>
+          </w:p>
+        </w:tc>
+        <w:tc>
+          <w:tcPr>
+            <w:tcW w:type="dxa" w:w="3312"/>
+            <w:shd w:fill="F8FAFC"/>
+          </w:tcPr>
+          <w:p>
+            <w:r>
+              <w:rPr>
+                <w:sz w:val="18"/>
+              </w:rPr>
+              <w:t>Strict linear turn execution, workflow templates, mid-stream reviewer insertion.</w:t>
+            </w:r>
+          </w:p>
+        </w:tc>
+      </w:tr>
+      <w:tr>
+        <w:tc>
+          <w:tcPr>
+            <w:tcW w:type="dxa" w:w="3312"/>
+          </w:tcPr>
+          <w:p>
+            <w:r>
+              <w:rPr>
+                <w:sz w:val="18"/>
+              </w:rPr>
+              <w:t>Req 11-13</w:t>
+            </w:r>
+          </w:p>
+        </w:tc>
+        <w:tc>
+          <w:tcPr>
+            <w:tcW w:type="dxa" w:w="3312"/>
+          </w:tcPr>
+          <w:p>
+            <w:r>
+              <w:rPr>
+                <w:sz w:val="18"/>
+              </w:rPr>
+              <w:t>Decisions &amp; Delegation</w:t>
+            </w:r>
+          </w:p>
+        </w:tc>
+        <w:tc>
+          <w:tcPr>
+            <w:tcW w:type="dxa" w:w="3312"/>
+          </w:tcPr>
+          <w:p>
+            <w:r>
+              <w:rPr>
+                <w:sz w:val="18"/>
+              </w:rPr>
+              <w:t>Approve, Reject, Request Changes with audit notes; date-bounded delegation.</w:t>
+            </w:r>
+          </w:p>
+        </w:tc>
+      </w:tr>
+      <w:tr>
+        <w:tc>
+          <w:tcPr>
+            <w:tcW w:type="dxa" w:w="3312"/>
+            <w:shd w:fill="F8FAFC"/>
+          </w:tcPr>
+          <w:p>
+            <w:r>
+              <w:rPr>
+                <w:sz w:val="18"/>
+              </w:rPr>
+              <w:t>Req 14-17</w:t>
+            </w:r>
+          </w:p>
+        </w:tc>
+        <w:tc>
+          <w:tcPr>
+            <w:tcW w:type="dxa" w:w="3312"/>
+            <w:shd w:fill="F8FAFC"/>
+          </w:tcPr>
+          <w:p>
+            <w:r>
+              <w:rPr>
+                <w:sz w:val="18"/>
+              </w:rPr>
+              <w:t>PDFs, Alerts &amp; Versions</w:t>
+            </w:r>
+          </w:p>
+        </w:tc>
+        <w:tc>
+          <w:tcPr>
+            <w:tcW w:type="dxa" w:w="3312"/>
+            <w:shd w:fill="F8FAFC"/>
+          </w:tcPr>
+          <w:p>
+            <w:r>
+              <w:rPr>
+                <w:sz w:val="18"/>
+              </w:rPr>
+              <w:t>Cryptographic PDF seal generation, notification tray, immutable version snapshots.</w:t>
+            </w:r>
+          </w:p>
+        </w:tc>
+      </w:tr>
+      <w:tr>
+        <w:tc>
+          <w:tcPr>
+            <w:tcW w:type="dxa" w:w="3312"/>
+          </w:tcPr>
+          <w:p>
+            <w:r>
+              <w:rPr>
+                <w:sz w:val="18"/>
+              </w:rPr>
+              <w:t>Req 18-22</w:t>
+            </w:r>
+          </w:p>
+        </w:tc>
+        <w:tc>
+          <w:tcPr>
+            <w:tcW w:type="dxa" w:w="3312"/>
+          </w:tcPr>
+          <w:p>
+            <w:r>
+              <w:rPr>
+                <w:sz w:val="18"/>
+              </w:rPr>
+              <w:t>Audit &amp; Security</w:t>
+            </w:r>
+          </w:p>
+        </w:tc>
+        <w:tc>
+          <w:tcPr>
+            <w:tcW w:type="dxa" w:w="3312"/>
+          </w:tcPr>
+          <w:p>
+            <w:r>
+              <w:rPr>
+                <w:sz w:val="18"/>
+              </w:rPr>
+              <w:t>Append-only audit logs, turnaround charts, admin self-deactivation protection.</w:t>
+            </w:r>
+          </w:p>
+        </w:tc>
+      </w:tr>
+      <w:tr>
+        <w:tc>
+          <w:tcPr>
+            <w:tcW w:type="dxa" w:w="3312"/>
+            <w:shd w:fill="F8FAFC"/>
+          </w:tcPr>
+          <w:p>
+            <w:r>
+              <w:rPr>
+                <w:sz w:val="18"/>
+              </w:rPr>
+              <w:t>Req 23-30</w:t>
+            </w:r>
+          </w:p>
+        </w:tc>
+        <w:tc>
+          <w:tcPr>
+            <w:tcW w:type="dxa" w:w="3312"/>
+            <w:shd w:fill="F8FAFC"/>
+          </w:tcPr>
+          <w:p>
+            <w:r>
+              <w:rPr>
+                <w:sz w:val="18"/>
+              </w:rPr>
+              <w:t>Deployment &amp; Testing</w:t>
+            </w:r>
+          </w:p>
+        </w:tc>
+        <w:tc>
+          <w:tcPr>
+            <w:tcW w:type="dxa" w:w="3312"/>
+            <w:shd w:fill="F8FAFC"/>
+          </w:tcPr>
+          <w:p>
+            <w:r>
+              <w:rPr>
+                <w:sz w:val="18"/>
+              </w:rPr>
+              <w:t>Live on Vercel, sanitized source ZIP, 20/20 passing pytest suite, full prompt log.</w:t>
+            </w:r>
+          </w:p>
+        </w:tc>
+      </w:tr>
+    </w:tbl>
+    <w:p/>
+    <w:p>
+      <w:pPr>
+        <w:pStyle w:val="Heading1"/>
+      </w:pPr>
+      <w:r>
+        <w:t>3. Technology Stack</w:t>
+      </w:r>
+    </w:p>
+    <w:tbl>
+      <w:tblPr>
+        <w:tblW w:type="auto" w:w="0"/>
+        <w:jc w:val="center"/>
+        <w:tblLook w:firstColumn="1" w:firstRow="1" w:lastColumn="0" w:lastRow="0" w:noHBand="0" w:noVBand="1" w:val="04A0"/>
+      </w:tblPr>
+      <w:tblGrid>
+        <w:gridCol w:w="4968"/>
+        <w:gridCol w:w="4968"/>
+      </w:tblGrid>
+      <w:tr>
+        <w:tc>
+          <w:tcPr>
+            <w:tcW w:type="dxa" w:w="4968"/>
+            <w:shd w:fill="312E81"/>
+          </w:tcPr>
+          <w:p>
+            <w:r>
+              <w:rPr>
+                <w:b/>
+                <w:color w:val="FFFFFF"/>
+                <w:sz w:val="19"/>
+              </w:rPr>
+              <w:t>Layer / Component</w:t>
+            </w:r>
+          </w:p>
+        </w:tc>
+        <w:tc>
+          <w:tcPr>
+            <w:tcW w:type="dxa" w:w="4968"/>
+            <w:shd w:fill="312E81"/>
+          </w:tcPr>
+          <w:p>
+            <w:r>
+              <w:rPr>
+                <w:b/>
+                <w:color w:val="FFFFFF"/>
+                <w:sz w:val="19"/>
+              </w:rPr>
+              <w:t>Technology &amp; Libraries</w:t>
+            </w:r>
+          </w:p>
+        </w:tc>
+      </w:tr>
+      <w:tr>
+        <w:tc>
+          <w:tcPr>
+            <w:tcW w:type="dxa" w:w="4968"/>
+            <w:shd w:fill="F8FAFC"/>
+          </w:tcPr>
+          <w:p>
+            <w:r>
+              <w:rPr>
+                <w:sz w:val="18"/>
+              </w:rPr>
+              <w:t>Backend API Framework</w:t>
+            </w:r>
+          </w:p>
+        </w:tc>
+        <w:tc>
+          <w:tcPr>
+            <w:tcW w:type="dxa" w:w="4968"/>
+            <w:shd w:fill="F8FAFC"/>
+          </w:tcPr>
+          <w:p>
+            <w:r>
+              <w:rPr>
+                <w:sz w:val="18"/>
+              </w:rPr>
+              <w:t>FastAPI (Asynchronous Python 3.10+ REST framework)</w:t>
+            </w:r>
+          </w:p>
+        </w:tc>
+      </w:tr>
+      <w:tr>
+        <w:tc>
+          <w:tcPr>
+            <w:tcW w:type="dxa" w:w="4968"/>
+          </w:tcPr>
+          <w:p>
+            <w:r>
+              <w:rPr>
+                <w:sz w:val="18"/>
+              </w:rPr>
+              <w:t>Database Engine &amp; ORM</w:t>
+            </w:r>
+          </w:p>
+        </w:tc>
+        <w:tc>
+          <w:tcPr>
+            <w:tcW w:type="dxa" w:w="4968"/>
+          </w:tcPr>
+          <w:p>
+            <w:r>
+              <w:rPr>
+                <w:sz w:val="18"/>
+              </w:rPr>
+              <w:t>PostgreSQL 16 (Neon Serverless Cloud DB) + SQLAlchemy 2.0 ORM</w:t>
+            </w:r>
+          </w:p>
+        </w:tc>
+      </w:tr>
+      <w:tr>
+        <w:tc>
+          <w:tcPr>
+            <w:tcW w:type="dxa" w:w="4968"/>
+            <w:shd w:fill="F8FAFC"/>
+          </w:tcPr>
+          <w:p>
+            <w:r>
+              <w:rPr>
+                <w:sz w:val="18"/>
+              </w:rPr>
+              <w:t>Authentication &amp; Security</w:t>
+            </w:r>
+          </w:p>
+        </w:tc>
+        <w:tc>
+          <w:tcPr>
+            <w:tcW w:type="dxa" w:w="4968"/>
+            <w:shd w:fill="F8FAFC"/>
+          </w:tcPr>
+          <w:p>
+            <w:r>
+              <w:rPr>
+                <w:sz w:val="18"/>
+              </w:rPr>
+              <w:t>PyJWT (JSON Web Tokens) + Passlib (PBKDF2-SHA256 &amp; Bcrypt hashing)</w:t>
+            </w:r>
+          </w:p>
+        </w:tc>
+      </w:tr>
+      <w:tr>
+        <w:tc>
+          <w:tcPr>
+            <w:tcW w:type="dxa" w:w="4968"/>
+          </w:tcPr>
+          <w:p>
+            <w:r>
+              <w:rPr>
+                <w:sz w:val="18"/>
+              </w:rPr>
+              <w:t>Frontend Single Page App</w:t>
+            </w:r>
+          </w:p>
+        </w:tc>
+        <w:tc>
+          <w:tcPr>
+            <w:tcW w:type="dxa" w:w="4968"/>
+          </w:tcPr>
+          <w:p>
+            <w:r>
+              <w:rPr>
+                <w:sz w:val="18"/>
+              </w:rPr>
+              <w:t>Vanilla JavaScript SPA engine (app.js) with zero build-step overhead</w:t>
+            </w:r>
+          </w:p>
+        </w:tc>
+      </w:tr>
+      <w:tr>
+        <w:tc>
+          <w:tcPr>
+            <w:tcW w:type="dxa" w:w="4968"/>
+            <w:shd w:fill="F8FAFC"/>
+          </w:tcPr>
+          <w:p>
+            <w:r>
+              <w:rPr>
+                <w:sz w:val="18"/>
+              </w:rPr>
+              <w:t>Styling &amp; Design System</w:t>
+            </w:r>
+          </w:p>
+        </w:tc>
+        <w:tc>
+          <w:tcPr>
+            <w:tcW w:type="dxa" w:w="4968"/>
+            <w:shd w:fill="F8FAFC"/>
+          </w:tcPr>
+          <w:p>
+            <w:r>
+              <w:rPr>
+                <w:sz w:val="18"/>
+              </w:rPr>
+              <w:t>Tailwind CSS utility framework + Lucide Icons + Google Fonts</w:t>
+            </w:r>
+          </w:p>
+        </w:tc>
+      </w:tr>
+      <w:tr>
+        <w:tc>
+          <w:tcPr>
+            <w:tcW w:type="dxa" w:w="4968"/>
+          </w:tcPr>
+          <w:p>
+            <w:r>
+              <w:rPr>
+                <w:sz w:val="18"/>
+              </w:rPr>
+              <w:t>Rich Text Authoring</w:t>
+            </w:r>
+          </w:p>
+        </w:tc>
+        <w:tc>
+          <w:tcPr>
+            <w:tcW w:type="dxa" w:w="4968"/>
+          </w:tcPr>
+          <w:p>
+            <w:r>
+              <w:rPr>
+                <w:sz w:val="18"/>
+              </w:rPr>
+              <w:t>Quill.js WYSIWYG editor with custom toolbar &amp; HTML sanitization</w:t>
+            </w:r>
+          </w:p>
+        </w:tc>
+      </w:tr>
+      <w:tr>
+        <w:tc>
+          <w:tcPr>
+            <w:tcW w:type="dxa" w:w="4968"/>
+            <w:shd w:fill="F8FAFC"/>
+          </w:tcPr>
+          <w:p>
+            <w:r>
+              <w:rPr>
+                <w:sz w:val="18"/>
+              </w:rPr>
+              <w:t>Visualizations &amp; Charts</w:t>
+            </w:r>
+          </w:p>
+        </w:tc>
+        <w:tc>
+          <w:tcPr>
+            <w:tcW w:type="dxa" w:w="4968"/>
+            <w:shd w:fill="F8FAFC"/>
+          </w:tcPr>
+          <w:p>
+            <w:r>
+              <w:rPr>
+                <w:sz w:val="18"/>
+              </w:rPr>
+              <w:t>Chart.js for real-time status doughnuts and turnaround duration bars</w:t>
+            </w:r>
+          </w:p>
+        </w:tc>
+      </w:tr>
+      <w:tr>
+        <w:tc>
+          <w:tcPr>
+            <w:tcW w:type="dxa" w:w="4968"/>
+          </w:tcPr>
+          <w:p>
+            <w:r>
+              <w:rPr>
+                <w:sz w:val="18"/>
+              </w:rPr>
+              <w:t>Document / PDF Engine</w:t>
+            </w:r>
+          </w:p>
+        </w:tc>
+        <w:tc>
+          <w:tcPr>
+            <w:tcW w:type="dxa" w:w="4968"/>
+          </w:tcPr>
+          <w:p>
+            <w:r>
+              <w:rPr>
+                <w:sz w:val="18"/>
+              </w:rPr>
+              <w:t>ReportLab &amp; xhtml2pdf with embedded signature stamps and QR codes</w:t>
+            </w:r>
+          </w:p>
+        </w:tc>
+      </w:tr>
+      <w:tr>
+        <w:tc>
+          <w:tcPr>
+            <w:tcW w:type="dxa" w:w="4968"/>
+            <w:shd w:fill="F8FAFC"/>
+          </w:tcPr>
+          <w:p>
+            <w:r>
+              <w:rPr>
+                <w:sz w:val="18"/>
+              </w:rPr>
+              <w:t>Cloud Infrastructure</w:t>
+            </w:r>
+          </w:p>
+        </w:tc>
+        <w:tc>
+          <w:tcPr>
+            <w:tcW w:type="dxa" w:w="4968"/>
+            <w:shd w:fill="F8FAFC"/>
+          </w:tcPr>
+          <w:p>
+            <w:r>
+              <w:rPr>
+                <w:sz w:val="18"/>
+              </w:rPr>
+              <w:t>Vercel Serverless Functions with automated CI/CD pipeline</w:t>
+            </w:r>
+          </w:p>
+        </w:tc>
+      </w:tr>
+      <w:tr>
+        <w:tc>
+          <w:tcPr>
+            <w:tcW w:type="dxa" w:w="4968"/>
+          </w:tcPr>
+          <w:p>
+            <w:r>
+              <w:rPr>
+                <w:sz w:val="18"/>
+              </w:rPr>
+              <w:t>Testing &amp; Tooling</w:t>
+            </w:r>
+          </w:p>
+        </w:tc>
+        <w:tc>
+          <w:tcPr>
+            <w:tcW w:type="dxa" w:w="4968"/>
+          </w:tcPr>
+          <w:p>
+            <w:r>
+              <w:rPr>
+                <w:sz w:val="18"/>
+              </w:rPr>
+              <w:t>Pytest automated test harness (20/20 tests passing) + Astral uv</w:t>
             </w:r>
           </w:p>
         </w:tc>
@@ -203,84 +974,12 @@
         <w:pStyle w:val="Heading1"/>
       </w:pPr>
       <w:r>
-        <w:t>26.1. System Overview</w:t>
-      </w:r>
-    </w:p>
-    <w:p>
-      <w:pPr>
-        <w:spacing w:line="276" w:lineRule="auto"/>
-      </w:pPr>
-      <w:r>
-        <w:t>The Inter-Office Memo Management System is a full-stack, enterprise-grade, multi-tenant Software-as-a-Service (SaaS) application developed to replace fragmented communication (such as unstructured email chains and messaging apps) with a centralized, auditable, and strictly governed workflow platform.</w:t>
-      </w:r>
-    </w:p>
-    <w:p>
-      <w:pPr>
-        <w:pStyle w:val="ListBullet"/>
-      </w:pPr>
-      <w:r>
-        <w:t>Key Core Capabilities:</w:t>
-      </w:r>
-    </w:p>
-    <w:p>
-      <w:pPr>
-        <w:pStyle w:val="ListBullet2"/>
-      </w:pPr>
-      <w:r>
-        <w:t>Strict Multi-Tenancy: Complete logical data isolation across distinct enterprise organizations within a single shared PostgreSQL database engine with automatic org_id security scoping.</w:t>
-      </w:r>
-    </w:p>
-    <w:p>
-      <w:pPr>
-        <w:pStyle w:val="ListBullet2"/>
-      </w:pPr>
-      <w:r>
-        <w:t>Deterministic Sequential Approval: Memos progress through strict, linear approval chains (Requester -&gt; Dept Head -&gt; Finance Manager -&gt; Director -&gt; CEO). Only the assigned turn holder (or designated delegate) can sign off.</w:t>
-      </w:r>
-    </w:p>
-    <w:p>
-      <w:pPr>
-        <w:pStyle w:val="ListBullet2"/>
-      </w:pPr>
-      <w:r>
-        <w:t>Dynamic Workflow Reconfigurability: Approvers can dynamically inject intermediate specialists (Approve &amp; Add Reviewer) or reroute turns on the fly without breaking audit trails.</w:t>
-      </w:r>
-    </w:p>
-    <w:p>
-      <w:pPr>
-        <w:pStyle w:val="ListBullet2"/>
-      </w:pPr>
-      <w:r>
-        <w:t>Active Workflow Delegation: Officers on leave can delegate approval authority with enforceable calendar date boundaries.</w:t>
-      </w:r>
-    </w:p>
-    <w:p>
-      <w:pPr>
-        <w:pStyle w:val="ListBullet2"/>
-      </w:pPr>
-      <w:r>
-        <w:t>Immutable Version Snapshotting: Every change request and resubmission preserves full historical snapshots for side-by-side audit inspection.</w:t>
-      </w:r>
-    </w:p>
-    <w:p>
-      <w:pPr>
-        <w:pStyle w:val="ListBullet2"/>
-      </w:pPr>
-      <w:r>
-        <w:t>Digital Signatures &amp; PDF Seal Engine: Generates official PDF memorandum documents complete with signature matrices, audit stamps, and QR code verification seals.</w:t>
-      </w:r>
-    </w:p>
-    <w:p>
-      <w:pPr>
-        <w:pStyle w:val="Heading1"/>
-      </w:pPr>
-      <w:r>
-        <w:t>26.2. Requirements Implemented</w:t>
+        <w:t>4. System Architecture &amp; Diagram</w:t>
       </w:r>
     </w:p>
     <w:p>
       <w:r>
-        <w:t>The system satisfies 100% of the project specification requirements across all functional and non-functional areas:</w:t>
+        <w:t>The application is structured into a clean 3-tier decoupled architecture comprising a Client SPA, a Stateless FastAPI REST API service layer, and a cloud-native PostgreSQL relational database.</w:t>
       </w:r>
     </w:p>
     <w:tbl>
@@ -290,360 +989,232 @@
         <w:tblLook w:firstColumn="1" w:firstRow="1" w:lastColumn="0" w:lastRow="0" w:noHBand="0" w:noVBand="1" w:val="04A0"/>
       </w:tblPr>
       <w:tblGrid>
-        <w:gridCol w:w="3120"/>
-        <w:gridCol w:w="3120"/>
-        <w:gridCol w:w="3120"/>
+        <w:gridCol w:w="9936"/>
       </w:tblGrid>
       <w:tr>
         <w:tc>
           <w:tcPr>
-            <w:tcW w:type="dxa" w:w="3120"/>
-            <w:shd w:fill="1E1B4B"/>
+            <w:tcW w:type="dxa" w:w="9792"/>
+            <w:shd w:fill="0F172A"/>
           </w:tcPr>
           <w:p>
+            <w:pPr>
+              <w:spacing w:before="80" w:after="80" w:line="240" w:lineRule="auto"/>
+            </w:pPr>
             <w:r>
               <w:rPr>
-                <w:b/>
-                <w:color w:val="FFFFFF"/>
-                <w:sz w:val="20"/>
+                <w:rFonts w:ascii="Consolas" w:hAnsi="Consolas"/>
+                <w:color w:val="E2E8F0"/>
+                <w:sz w:val="17"/>
               </w:rPr>
-              <w:t>Requirement Area</w:t>
-            </w:r>
-          </w:p>
-        </w:tc>
-        <w:tc>
-          <w:tcPr>
-            <w:tcW w:type="dxa" w:w="3120"/>
-            <w:shd w:fill="1E1B4B"/>
-          </w:tcPr>
-          <w:p>
-            <w:r>
-              <w:rPr>
-                <w:b/>
-                <w:color w:val="FFFFFF"/>
-                <w:sz w:val="20"/>
-              </w:rPr>
-              <w:t>Core Feature Focus</w:t>
-            </w:r>
-          </w:p>
-        </w:tc>
-        <w:tc>
-          <w:tcPr>
-            <w:tcW w:type="dxa" w:w="3120"/>
-            <w:shd w:fill="1E1B4B"/>
-          </w:tcPr>
-          <w:p>
-            <w:r>
-              <w:rPr>
-                <w:b/>
-                <w:color w:val="FFFFFF"/>
-                <w:sz w:val="20"/>
-              </w:rPr>
-              <w:t>Implementation Summary</w:t>
-            </w:r>
-          </w:p>
-        </w:tc>
-      </w:tr>
-      <w:tr>
-        <w:tc>
-          <w:tcPr>
-            <w:tcW w:type="dxa" w:w="3120"/>
-            <w:shd w:fill="F8FAFC"/>
-          </w:tcPr>
-          <w:p>
-            <w:r>
-              <w:rPr>
-                <w:sz w:val="19"/>
-              </w:rPr>
-              <w:t>Req 1-4</w:t>
-            </w:r>
-          </w:p>
-        </w:tc>
-        <w:tc>
-          <w:tcPr>
-            <w:tcW w:type="dxa" w:w="3120"/>
-            <w:shd w:fill="F8FAFC"/>
-          </w:tcPr>
-          <w:p>
-            <w:r>
-              <w:rPr>
-                <w:sz w:val="19"/>
-              </w:rPr>
-              <w:t>Multi-Tenancy &amp; RBAC</w:t>
-            </w:r>
-          </w:p>
-        </w:tc>
-        <w:tc>
-          <w:tcPr>
-            <w:tcW w:type="dxa" w:w="3120"/>
-            <w:shd w:fill="F8FAFC"/>
-          </w:tcPr>
-          <w:p>
-            <w:r>
-              <w:rPr>
-                <w:sz w:val="19"/>
-              </w:rPr>
-              <w:t>Complete logical tenant isolation, user role hierarchy (Admin/User), department management.</w:t>
-            </w:r>
-          </w:p>
-        </w:tc>
-      </w:tr>
-      <w:tr>
-        <w:tc>
-          <w:tcPr>
-            <w:tcW w:type="dxa" w:w="3120"/>
-          </w:tcPr>
-          <w:p>
-            <w:r>
-              <w:rPr>
-                <w:sz w:val="19"/>
-              </w:rPr>
-              <w:t>Req 5-7</w:t>
-            </w:r>
-          </w:p>
-        </w:tc>
-        <w:tc>
-          <w:tcPr>
-            <w:tcW w:type="dxa" w:w="3120"/>
-          </w:tcPr>
-          <w:p>
-            <w:r>
-              <w:rPr>
-                <w:sz w:val="19"/>
-              </w:rPr>
-              <w:t>Auth &amp; Memo Authoring</w:t>
-            </w:r>
-          </w:p>
-        </w:tc>
-        <w:tc>
-          <w:tcPr>
-            <w:tcW w:type="dxa" w:w="3120"/>
-          </w:tcPr>
-          <w:p>
-            <w:r>
-              <w:rPr>
-                <w:sz w:val="19"/>
-              </w:rPr>
-              <w:t>JWT tokens, password reset, Quill.js rich text editor, priority tags, file attachments.</w:t>
-            </w:r>
-          </w:p>
-        </w:tc>
-      </w:tr>
-      <w:tr>
-        <w:tc>
-          <w:tcPr>
-            <w:tcW w:type="dxa" w:w="3120"/>
-            <w:shd w:fill="F8FAFC"/>
-          </w:tcPr>
-          <w:p>
-            <w:r>
-              <w:rPr>
-                <w:sz w:val="19"/>
-              </w:rPr>
-              <w:t>Req 8-10</w:t>
-            </w:r>
-          </w:p>
-        </w:tc>
-        <w:tc>
-          <w:tcPr>
-            <w:tcW w:type="dxa" w:w="3120"/>
-            <w:shd w:fill="F8FAFC"/>
-          </w:tcPr>
-          <w:p>
-            <w:r>
-              <w:rPr>
-                <w:sz w:val="19"/>
-              </w:rPr>
-              <w:t>Sequential Workflow Engine</w:t>
-            </w:r>
-          </w:p>
-        </w:tc>
-        <w:tc>
-          <w:tcPr>
-            <w:tcW w:type="dxa" w:w="3120"/>
-            <w:shd w:fill="F8FAFC"/>
-          </w:tcPr>
-          <w:p>
-            <w:r>
-              <w:rPr>
-                <w:sz w:val="19"/>
-              </w:rPr>
-              <w:t>Deterministic linear turns, predefined templates, dynamic mid-workflow reviewer insertion.</w:t>
-            </w:r>
-          </w:p>
-        </w:tc>
-      </w:tr>
-      <w:tr>
-        <w:tc>
-          <w:tcPr>
-            <w:tcW w:type="dxa" w:w="3120"/>
-          </w:tcPr>
-          <w:p>
-            <w:r>
-              <w:rPr>
-                <w:sz w:val="19"/>
-              </w:rPr>
-              <w:t>Req 11-13</w:t>
-            </w:r>
-          </w:p>
-        </w:tc>
-        <w:tc>
-          <w:tcPr>
-            <w:tcW w:type="dxa" w:w="3120"/>
-          </w:tcPr>
-          <w:p>
-            <w:r>
-              <w:rPr>
-                <w:sz w:val="19"/>
-              </w:rPr>
-              <w:t>Decision Governance &amp; Delegation</w:t>
-            </w:r>
-          </w:p>
-        </w:tc>
-        <w:tc>
-          <w:tcPr>
-            <w:tcW w:type="dxa" w:w="3120"/>
-          </w:tcPr>
-          <w:p>
-            <w:r>
-              <w:rPr>
-                <w:sz w:val="19"/>
-              </w:rPr>
-              <w:t>Approve, Reject, Request Changes with audit comments; date-bounded workflow delegation.</w:t>
-            </w:r>
-          </w:p>
-        </w:tc>
-      </w:tr>
-      <w:tr>
-        <w:tc>
-          <w:tcPr>
-            <w:tcW w:type="dxa" w:w="3120"/>
-            <w:shd w:fill="F8FAFC"/>
-          </w:tcPr>
-          <w:p>
-            <w:r>
-              <w:rPr>
-                <w:sz w:val="19"/>
-              </w:rPr>
-              <w:t>Req 14-17</w:t>
-            </w:r>
-          </w:p>
-        </w:tc>
-        <w:tc>
-          <w:tcPr>
-            <w:tcW w:type="dxa" w:w="3120"/>
-            <w:shd w:fill="F8FAFC"/>
-          </w:tcPr>
-          <w:p>
-            <w:r>
-              <w:rPr>
-                <w:sz w:val="19"/>
-              </w:rPr>
-              <w:t>PDFs, Alerts &amp; Versioning</w:t>
-            </w:r>
-          </w:p>
-        </w:tc>
-        <w:tc>
-          <w:tcPr>
-            <w:tcW w:type="dxa" w:w="3120"/>
-            <w:shd w:fill="F8FAFC"/>
-          </w:tcPr>
-          <w:p>
-            <w:r>
-              <w:rPr>
-                <w:sz w:val="19"/>
-              </w:rPr>
-              <w:t>Cryptographic PDF seal generation, in-app notification dropdown, immutable version history.</w:t>
-            </w:r>
-          </w:p>
-        </w:tc>
-      </w:tr>
-      <w:tr>
-        <w:tc>
-          <w:tcPr>
-            <w:tcW w:type="dxa" w:w="3120"/>
-          </w:tcPr>
-          <w:p>
-            <w:r>
-              <w:rPr>
-                <w:sz w:val="19"/>
-              </w:rPr>
-              <w:t>Req 18-22</w:t>
-            </w:r>
-          </w:p>
-        </w:tc>
-        <w:tc>
-          <w:tcPr>
-            <w:tcW w:type="dxa" w:w="3120"/>
-          </w:tcPr>
-          <w:p>
-            <w:r>
-              <w:rPr>
-                <w:sz w:val="19"/>
-              </w:rPr>
-              <w:t>Audit, Analytics &amp; Security</w:t>
-            </w:r>
-          </w:p>
-        </w:tc>
-        <w:tc>
-          <w:tcPr>
-            <w:tcW w:type="dxa" w:w="3120"/>
-          </w:tcPr>
-          <w:p>
-            <w:r>
-              <w:rPr>
-                <w:sz w:val="19"/>
-              </w:rPr>
-              <w:t>Immutable event logs, turnaround analytics charts, admin self-deactivation protection.</w:t>
-            </w:r>
-          </w:p>
-        </w:tc>
-      </w:tr>
-      <w:tr>
-        <w:tc>
-          <w:tcPr>
-            <w:tcW w:type="dxa" w:w="3120"/>
-            <w:shd w:fill="F8FAFC"/>
-          </w:tcPr>
-          <w:p>
-            <w:r>
-              <w:rPr>
-                <w:sz w:val="19"/>
-              </w:rPr>
-              <w:t>Req 23-30</w:t>
-            </w:r>
-          </w:p>
-        </w:tc>
-        <w:tc>
-          <w:tcPr>
-            <w:tcW w:type="dxa" w:w="3120"/>
-            <w:shd w:fill="F8FAFC"/>
-          </w:tcPr>
-          <w:p>
-            <w:r>
-              <w:rPr>
-                <w:sz w:val="19"/>
-              </w:rPr>
-              <w:t>Deployment &amp; Verification</w:t>
-            </w:r>
-          </w:p>
-        </w:tc>
-        <w:tc>
-          <w:tcPr>
-            <w:tcW w:type="dxa" w:w="3120"/>
-            <w:shd w:fill="F8FAFC"/>
-          </w:tcPr>
-          <w:p>
-            <w:r>
-              <w:rPr>
-                <w:sz w:val="19"/>
-              </w:rPr>
-              <w:t>Live Vercel deployment, sanitized source zip, 20/20 passing pytest suite, full AI prompt log.</w:t>
+              <w:t>+-----------------------------------------------------------------------------+</w:t>
+              <w:br/>
+              <w:t>|                            CLIENT TIER (Browser / Mobile)                   |</w:t>
+              <w:br/>
+              <w:t>|  - Vanilla JS SPA Router (showView)           - Tailwind Responsive Layout  |</w:t>
+              <w:br/>
+              <w:t>|  - Reactive State Store (appState)            - Quill.js WYSIWYG Editor     |</w:t>
+              <w:br/>
+              <w:t>|  - Interactive Chart.js Visualizations        - Lucide Icon System          |</w:t>
+              <w:br/>
+              <w:t>+--------------------------------------+--------------------------------------+</w:t>
+              <w:br/>
+              <w:t xml:space="preserve">                                       | HTTP REST / Bearer JWT</w:t>
+              <w:br/>
+              <w:t xml:space="preserve">                                       v</w:t>
+              <w:br/>
+              <w:t>+-----------------------------------------------------------------------------+</w:t>
+              <w:br/>
+              <w:t>|                     APPLICATION &amp; REST API TIER (FastAPI)                   |</w:t>
+              <w:br/>
+              <w:t>|  +-------------------+  +--------------------+  +------------------------+  |</w:t>
+              <w:br/>
+              <w:t>|  |   /auth Router    |  |   /memos Router    |  |   /workflow Router     |  |</w:t>
+              <w:br/>
+              <w:t>|  | - JWT Auth &amp; Reset|  | - CRUD &amp; Attachments| | - Action &amp; Turn Engine |  |</w:t>
+              <w:br/>
+              <w:t>|  +-------------------+  +--------------------+  +------------------------+  |</w:t>
+              <w:br/>
+              <w:t>|  +-------------------+  +--------------------+  +------------------------+  |</w:t>
+              <w:br/>
+              <w:t>|  |   /admin Router   |  |   /reports Router  |  |  /delegations Router   |  |</w:t>
+              <w:br/>
+              <w:t>|  | - Users &amp; Depts   |  | - Analytics Stats  |  | - Date-Bounded Rules   |  |</w:t>
+              <w:br/>
+              <w:t>|  +-------------------+  +--------------------+  +------------------------+  |</w:t>
+              <w:br/>
+              <w:t>+--------------------------------------+--------------------------------------+</w:t>
+              <w:br/>
+              <w:t xml:space="preserve">                                       | Internal Service Invocations</w:t>
+              <w:br/>
+              <w:t xml:space="preserve">                                       v</w:t>
+              <w:br/>
+              <w:t>+-----------------------------------------------------------------------------+</w:t>
+              <w:br/>
+              <w:t>|                        CORE BUSINESS LOGIC SERVICES                         |</w:t>
+              <w:br/>
+              <w:t>|  - Workflow State Machine        - Immutable Version Snapshotting           |</w:t>
+              <w:br/>
+              <w:t>|  - Cryptographic PDF &amp; QR Engine - Real-Time In-App Notification Dispatcher |</w:t>
+              <w:br/>
+              <w:t>|  - Append-Only Audit Logger      - Role-Based Access Control (RBAC) Guard   |</w:t>
+              <w:br/>
+              <w:t>+--------------------------------------+--------------------------------------+</w:t>
+              <w:br/>
+              <w:t xml:space="preserve">                                       | SQLAlchemy 2.0 (SSL / Connection Pool)</w:t>
+              <w:br/>
+              <w:t xml:space="preserve">                                       v</w:t>
+              <w:br/>
+              <w:t>+-----------------------------------------------------------------------------+</w:t>
+              <w:br/>
+              <w:t>|                     DATA &amp; STORAGE TIER (Neon PostgreSQL)                   |</w:t>
+              <w:br/>
+              <w:t>|  [organizations]  [users]        [departments]  [memo_categories]           |</w:t>
+              <w:br/>
+              <w:t>|  [memos]          [memo_steps]   [memo_versions][workflow_delegations]      |</w:t>
+              <w:br/>
+              <w:t>|  [memo_comments]  [attachments]  [audit_logs]   [notifications]             |</w:t>
+              <w:br/>
+              <w:t>+-----------------------------------------------------------------------------+</w:t>
             </w:r>
           </w:p>
         </w:tc>
       </w:tr>
     </w:tbl>
+    <w:p>
+      <w:pPr>
+        <w:jc w:val="center"/>
+      </w:pPr>
+      <w:r>
+        <w:rPr>
+          <w:i/>
+          <w:color w:val="64748B"/>
+          <w:sz w:val="18"/>
+        </w:rPr>
+        <w:t>Figure: High-Level 3-Tier System Architecture Diagram</w:t>
+      </w:r>
+    </w:p>
+    <w:p/>
+    <w:p>
+      <w:pPr>
+        <w:pStyle w:val="Heading1"/>
+      </w:pPr>
+      <w:r>
+        <w:t>5. Database Design &amp; Multi-Tenancy Enforcement</w:t>
+      </w:r>
+    </w:p>
+    <w:p>
+      <w:r>
+        <w:t>Multi-tenancy is enforced through strict logical data partitioning. Every single table in the database contains a non-nullable foreign key referencing organizations.id. Multi-tenancy is guaranteed at the database and API layer through the following mechanisms:</w:t>
+      </w:r>
+    </w:p>
+    <w:p>
+      <w:pPr>
+        <w:pStyle w:val="ListBullet"/>
+      </w:pPr>
+      <w:r>
+        <w:t>• Server-Side Query Scoping: Every database query in all routers automatically includes models.Entity.org_id == current_user.org_id. Client-side filtering is never relied upon for security.</w:t>
+      </w:r>
+    </w:p>
+    <w:p>
+      <w:pPr>
+        <w:pStyle w:val="ListBullet"/>
+      </w:pPr>
+      <w:r>
+        <w:t>• Direct Object Access Validation: When accessing a resource by ID (e.g. GET /memos/10), the server verifies memo.org_id == current_user.org_id. If the tenant IDs mismatch, an immediate HTTP 404/403 is thrown.</w:t>
+      </w:r>
+    </w:p>
+    <w:p>
+      <w:pPr>
+        <w:pStyle w:val="ListBullet"/>
+      </w:pPr>
+      <w:r>
+        <w:t>• Cascade Isolation: Deleting or modifying a department, user, or workflow step is strictly constrained to the user's organization.</w:t>
+      </w:r>
+    </w:p>
+    <w:tbl>
+      <w:tblPr>
+        <w:tblW w:type="auto" w:w="0"/>
+        <w:jc w:val="center"/>
+        <w:tblLook w:firstColumn="1" w:firstRow="1" w:lastColumn="0" w:lastRow="0" w:noHBand="0" w:noVBand="1" w:val="04A0"/>
+      </w:tblPr>
+      <w:tblGrid>
+        <w:gridCol w:w="9936"/>
+      </w:tblGrid>
+      <w:tr>
+        <w:tc>
+          <w:tcPr>
+            <w:tcW w:type="dxa" w:w="9792"/>
+            <w:shd w:fill="0F172A"/>
+          </w:tcPr>
+          <w:p>
+            <w:pPr>
+              <w:spacing w:before="80" w:after="80" w:line="240" w:lineRule="auto"/>
+            </w:pPr>
+            <w:r>
+              <w:rPr>
+                <w:rFonts w:ascii="Consolas" w:hAnsi="Consolas"/>
+                <w:color w:val="E2E8F0"/>
+                <w:sz w:val="17"/>
+              </w:rPr>
+              <w:t>+-------------------+        +-------------------+        +----------------------+</w:t>
+              <w:br/>
+              <w:t>|   ORGANIZATION    | 1    * |       USER        | 1    * |         MEMO         |</w:t>
+              <w:br/>
+              <w:t>|-------------------|--------|-------------------|--------|----------------------|</w:t>
+              <w:br/>
+              <w:t>| id (PK)           |        | id (PK)           |        | id (PK)              |</w:t>
+              <w:br/>
+              <w:t>| name, code        |        | org_id (FK)       |        | org_id (FK)          |</w:t>
+              <w:br/>
+              <w:t>| contact_email     |        | department_id(FK) |        | memo_number, title   |</w:t>
+              <w:br/>
+              <w:t>+-------------------+        | full_name, email  |        | body_html, priority  |</w:t>
+              <w:br/>
+              <w:t xml:space="preserve">                             | role, is_active   |        | status, author_id    |</w:t>
+              <w:br/>
+              <w:t xml:space="preserve">                             +-------------------+        | current_assignee_id  |</w:t>
+              <w:br/>
+              <w:t xml:space="preserve">                                                          +----------+-----------+</w:t>
+              <w:br/>
+              <w:t xml:space="preserve">                                                                     | 1</w:t>
+              <w:br/>
+              <w:t xml:space="preserve">                                                                     | *</w:t>
+              <w:br/>
+              <w:t>+-----------------------+    +-----------------------+    +----------v-----------+</w:t>
+              <w:br/>
+              <w:t>|    MEMO_VERSION       |    |   WORKFLOW_DELEGATION |    |  MEMO_WORKFLOW_STEP  |</w:t>
+              <w:br/>
+              <w:t>|-----------------------|    |-----------------------|    |----------------------|</w:t>
+              <w:br/>
+              <w:t>| id (PK), memo_id (FK) |    | id (PK), org_id (FK)  |    | id (PK), memo_id(FK) |</w:t>
+              <w:br/>
+              <w:t>| version_num, body_html|    | delegator_id (FK)     |    | step_index, role_name|</w:t>
+              <w:br/>
+              <w:t>| change_summary        |    | delegatee_id (FK)     |    | assigned_user_id (FK)|</w:t>
+              <w:br/>
+              <w:t>| created_by, created_at|    | start_date, end_date  |    | status, decision     |</w:t>
+              <w:br/>
+              <w:t>+-----------------------+    +-----------------------+    +----------------------+</w:t>
+            </w:r>
+          </w:p>
+        </w:tc>
+      </w:tr>
+    </w:tbl>
+    <w:p>
+      <w:pPr>
+        <w:jc w:val="center"/>
+      </w:pPr>
+      <w:r>
+        <w:rPr>
+          <w:i/>
+          <w:color w:val="64748B"/>
+          <w:sz w:val="18"/>
+        </w:rPr>
+        <w:t>Figure: Entity-Relationship &amp; Multi-Tenancy Diagram</w:t>
+      </w:r>
+    </w:p>
+    <w:p/>
     <w:p>
       <w:r>
         <w:br w:type="page"/>
@@ -654,7 +1225,12 @@
         <w:pStyle w:val="Heading1"/>
       </w:pPr>
       <w:r>
-        <w:t>26.3. Technology Stack</w:t>
+        <w:t>6. Sequential Workflow Design &amp; Turn Governance</w:t>
+      </w:r>
+    </w:p>
+    <w:p>
+      <w:r>
+        <w:t>The sequential workflow engine operates as a deterministic finite-state machine with strict turn-based locks. Only the currently assigned participant (or their authorized active delegate) can sign off.</w:t>
       </w:r>
     </w:p>
     <w:tbl>
@@ -664,39 +1240,124 @@
         <w:tblLook w:firstColumn="1" w:firstRow="1" w:lastColumn="0" w:lastRow="0" w:noHBand="0" w:noVBand="1" w:val="04A0"/>
       </w:tblPr>
       <w:tblGrid>
-        <w:gridCol w:w="4680"/>
-        <w:gridCol w:w="4680"/>
+        <w:gridCol w:w="9936"/>
       </w:tblGrid>
       <w:tr>
         <w:tc>
           <w:tcPr>
-            <w:tcW w:type="dxa" w:w="4680"/>
-            <w:shd w:fill="312E81"/>
+            <w:tcW w:type="dxa" w:w="9792"/>
+            <w:shd w:fill="0F172A"/>
+          </w:tcPr>
+          <w:p>
+            <w:pPr>
+              <w:spacing w:before="80" w:after="80" w:line="240" w:lineRule="auto"/>
+            </w:pPr>
+            <w:r>
+              <w:rPr>
+                <w:rFonts w:ascii="Consolas" w:hAnsi="Consolas"/>
+                <w:color w:val="E2E8F0"/>
+                <w:sz w:val="17"/>
+              </w:rPr>
+              <w:t xml:space="preserve">    [ Author Creates Memo ] </w:t>
+              <w:br/>
+              <w:t xml:space="preserve">               |</w:t>
+              <w:br/>
+              <w:t xml:space="preserve">               v</w:t>
+              <w:br/>
+              <w:t xml:space="preserve">         [ DRAFT STATE ]  &lt;====================================+</w:t>
+              <w:br/>
+              <w:t xml:space="preserve">               |                                               |</w:t>
+              <w:br/>
+              <w:t xml:space="preserve">        Author Submits                                         |</w:t>
+              <w:br/>
+              <w:t xml:space="preserve">               v                                               |</w:t>
+              <w:br/>
+              <w:t xml:space="preserve">     +-------------------------------------------------------+ |</w:t>
+              <w:br/>
+              <w:t xml:space="preserve">     |           PENDING APPROVAL / REVIEW STATE             | |</w:t>
+              <w:br/>
+              <w:t xml:space="preserve">     |                                                       | |</w:t>
+              <w:br/>
+              <w:t xml:space="preserve">     |  Step 1: Dept Head  ===&gt; Approve ===&gt; Step 2          | |</w:t>
+              <w:br/>
+              <w:t xml:space="preserve">     |  Step 2: Finance    ===&gt; Approve ===&gt; Step 3          | |</w:t>
+              <w:br/>
+              <w:t xml:space="preserve">     |  Step 3: Director   ===&gt; Approve ===&gt; Step 4          | |</w:t>
+              <w:br/>
+              <w:t xml:space="preserve">     |  Step 4: CEO        ===&gt; Approve ===&gt; [ APPROVED ]    | |</w:t>
+              <w:br/>
+              <w:t xml:space="preserve">     +---------+--------------------+------------------------+ |</w:t>
+              <w:br/>
+              <w:t xml:space="preserve">               |                    |                          |</w:t>
+              <w:br/>
+              <w:t xml:space="preserve">        Reviewer Rejects      Request Changes                  |</w:t>
+              <w:br/>
+              <w:t xml:space="preserve">               |                    |                          |</w:t>
+              <w:br/>
+              <w:t xml:space="preserve">               v                    +==========================+</w:t>
+              <w:br/>
+              <w:t xml:space="preserve">         [ REJECTED ]              (Returns to Author for edits;</w:t>
+              <w:br/>
+              <w:t xml:space="preserve">     (Workflow Terminated)          Creates immutable MemoVersion snapshot)</w:t>
+            </w:r>
+          </w:p>
+        </w:tc>
+      </w:tr>
+    </w:tbl>
+    <w:p>
+      <w:pPr>
+        <w:jc w:val="center"/>
+      </w:pPr>
+      <w:r>
+        <w:rPr>
+          <w:i/>
+          <w:color w:val="64748B"/>
+          <w:sz w:val="18"/>
+        </w:rPr>
+        <w:t>Figure: Sequential Approval Workflow State Machine Diagram</w:t>
+      </w:r>
+    </w:p>
+    <w:p/>
+    <w:tbl>
+      <w:tblPr>
+        <w:tblW w:type="auto" w:w="0"/>
+        <w:jc w:val="center"/>
+        <w:tblLook w:firstColumn="1" w:firstRow="1" w:lastColumn="0" w:lastRow="0" w:noHBand="0" w:noVBand="1" w:val="04A0"/>
+      </w:tblPr>
+      <w:tblGrid>
+        <w:gridCol w:w="4968"/>
+        <w:gridCol w:w="4968"/>
+      </w:tblGrid>
+      <w:tr>
+        <w:tc>
+          <w:tcPr>
+            <w:tcW w:type="dxa" w:w="4968"/>
+            <w:shd w:fill="1E1B4B"/>
           </w:tcPr>
           <w:p>
             <w:r>
               <w:rPr>
                 <w:b/>
                 <w:color w:val="FFFFFF"/>
-                <w:sz w:val="20"/>
+                <w:sz w:val="19"/>
               </w:rPr>
-              <w:t>Component Layer</w:t>
+              <w:t>Workflow Stage / Rule</w:t>
             </w:r>
           </w:p>
         </w:tc>
         <w:tc>
           <w:tcPr>
-            <w:tcW w:type="dxa" w:w="4680"/>
-            <w:shd w:fill="312E81"/>
+            <w:tcW w:type="dxa" w:w="4968"/>
+            <w:shd w:fill="1E1B4B"/>
           </w:tcPr>
           <w:p>
             <w:r>
               <w:rPr>
                 <w:b/>
                 <w:color w:val="FFFFFF"/>
-                <w:sz w:val="20"/>
+                <w:sz w:val="19"/>
               </w:rPr>
-              <w:t>Technologies &amp; Libraries Used</w:t>
+              <w:t>Operational Behavior &amp; Governance</w:t>
             </w:r>
           </w:p>
         </w:tc>
@@ -704,29 +1365,29 @@
       <w:tr>
         <w:tc>
           <w:tcPr>
-            <w:tcW w:type="dxa" w:w="4680"/>
+            <w:tcW w:type="dxa" w:w="4968"/>
             <w:shd w:fill="F8FAFC"/>
           </w:tcPr>
           <w:p>
             <w:r>
               <w:rPr>
-                <w:sz w:val="19"/>
+                <w:sz w:val="18"/>
               </w:rPr>
-              <w:t>Backend API Framework</w:t>
+              <w:t>Draft -&gt; Submission</w:t>
             </w:r>
           </w:p>
         </w:tc>
         <w:tc>
           <w:tcPr>
-            <w:tcW w:type="dxa" w:w="4680"/>
+            <w:tcW w:type="dxa" w:w="4968"/>
             <w:shd w:fill="F8FAFC"/>
           </w:tcPr>
           <w:p>
             <w:r>
               <w:rPr>
-                <w:sz w:val="19"/>
+                <w:sz w:val="18"/>
               </w:rPr>
-              <w:t>FastAPI 0.115+ (Asynchronous Python REST framework)</w:t>
+              <w:t>Author drafts memo and defines sequence. Submitting advances turn to Step 1 and dispatches notifications.</w:t>
             </w:r>
           </w:p>
         </w:tc>
@@ -734,27 +1395,27 @@
       <w:tr>
         <w:tc>
           <w:tcPr>
-            <w:tcW w:type="dxa" w:w="4680"/>
+            <w:tcW w:type="dxa" w:w="4968"/>
           </w:tcPr>
           <w:p>
             <w:r>
               <w:rPr>
-                <w:sz w:val="19"/>
+                <w:sz w:val="18"/>
               </w:rPr>
-              <w:t>Database &amp; ORM</w:t>
+              <w:t>Step-by-Step Turns</w:t>
             </w:r>
           </w:p>
         </w:tc>
         <w:tc>
           <w:tcPr>
-            <w:tcW w:type="dxa" w:w="4680"/>
+            <w:tcW w:type="dxa" w:w="4968"/>
           </w:tcPr>
           <w:p>
             <w:r>
               <w:rPr>
-                <w:sz w:val="19"/>
+                <w:sz w:val="18"/>
               </w:rPr>
-              <w:t>PostgreSQL 16 (Neon Serverless Cloud Database) + SQLAlchemy 2.0 ORM</w:t>
+              <w:t>Step N must be completed before Step N+1 can act. Later approvers are physically blocked by server-side checks.</w:t>
             </w:r>
           </w:p>
         </w:tc>
@@ -762,29 +1423,29 @@
       <w:tr>
         <w:tc>
           <w:tcPr>
-            <w:tcW w:type="dxa" w:w="4680"/>
+            <w:tcW w:type="dxa" w:w="4968"/>
             <w:shd w:fill="F8FAFC"/>
           </w:tcPr>
           <w:p>
             <w:r>
               <w:rPr>
-                <w:sz w:val="19"/>
+                <w:sz w:val="18"/>
               </w:rPr>
-              <w:t>Authentication &amp; Security</w:t>
+              <w:t>Dynamic Reviewer Insertion</w:t>
             </w:r>
           </w:p>
         </w:tc>
         <w:tc>
           <w:tcPr>
-            <w:tcW w:type="dxa" w:w="4680"/>
+            <w:tcW w:type="dxa" w:w="4968"/>
             <w:shd w:fill="F8FAFC"/>
           </w:tcPr>
           <w:p>
             <w:r>
               <w:rPr>
-                <w:sz w:val="19"/>
+                <w:sz w:val="18"/>
               </w:rPr>
-              <w:t>Stateless JSON Web Tokens (PyJWT) + Passlib (PBKDF2-SHA256 password hashing)</w:t>
+              <w:t>Approver can select 'Approve &amp; Add Reviewer' to insert a specialist (e.g. Legal Counsel) before next step.</w:t>
             </w:r>
           </w:p>
         </w:tc>
@@ -792,27 +1453,27 @@
       <w:tr>
         <w:tc>
           <w:tcPr>
-            <w:tcW w:type="dxa" w:w="4680"/>
+            <w:tcW w:type="dxa" w:w="4968"/>
           </w:tcPr>
           <w:p>
             <w:r>
               <w:rPr>
-                <w:sz w:val="19"/>
+                <w:sz w:val="18"/>
               </w:rPr>
-              <w:t>Frontend Single Page App</w:t>
+              <w:t>Decline &amp; Reroute</w:t>
             </w:r>
           </w:p>
         </w:tc>
         <w:tc>
           <w:tcPr>
-            <w:tcW w:type="dxa" w:w="4680"/>
+            <w:tcW w:type="dxa" w:w="4968"/>
           </w:tcPr>
           <w:p>
             <w:r>
               <w:rPr>
-                <w:sz w:val="19"/>
+                <w:sz w:val="18"/>
               </w:rPr>
-              <w:t>Lightweight Vanilla JavaScript SPA engine (app.js) with zero build overhead</w:t>
+              <w:t>Turn holder can reassign their active step to an eligible colleague in the same organization.</w:t>
             </w:r>
           </w:p>
         </w:tc>
@@ -820,29 +1481,29 @@
       <w:tr>
         <w:tc>
           <w:tcPr>
-            <w:tcW w:type="dxa" w:w="4680"/>
+            <w:tcW w:type="dxa" w:w="4968"/>
             <w:shd w:fill="F8FAFC"/>
           </w:tcPr>
           <w:p>
             <w:r>
               <w:rPr>
-                <w:sz w:val="19"/>
+                <w:sz w:val="18"/>
               </w:rPr>
-              <w:t>Styling &amp; Design System</w:t>
+              <w:t>Delegation Protocol</w:t>
             </w:r>
           </w:p>
         </w:tc>
         <w:tc>
           <w:tcPr>
-            <w:tcW w:type="dxa" w:w="4680"/>
+            <w:tcW w:type="dxa" w:w="4968"/>
             <w:shd w:fill="F8FAFC"/>
           </w:tcPr>
           <w:p>
             <w:r>
               <w:rPr>
-                <w:sz w:val="19"/>
+                <w:sz w:val="18"/>
               </w:rPr>
-              <w:t>Tailwind CSS utility framework with mobile responsive viewports &amp; Lucide Icons</w:t>
+              <w:t>When active date window is valid, designated delegatee can sign off on behalf of delegator with full audit attribution.</w:t>
             </w:r>
           </w:p>
         </w:tc>
@@ -850,27 +1511,27 @@
       <w:tr>
         <w:tc>
           <w:tcPr>
-            <w:tcW w:type="dxa" w:w="4680"/>
+            <w:tcW w:type="dxa" w:w="4968"/>
           </w:tcPr>
           <w:p>
             <w:r>
               <w:rPr>
-                <w:sz w:val="19"/>
+                <w:sz w:val="18"/>
               </w:rPr>
-              <w:t>Rich Text Authoring</w:t>
+              <w:t>Changes Requested Cycle</w:t>
             </w:r>
           </w:p>
         </w:tc>
         <w:tc>
           <w:tcPr>
-            <w:tcW w:type="dxa" w:w="4680"/>
+            <w:tcW w:type="dxa" w:w="4968"/>
           </w:tcPr>
           <w:p>
             <w:r>
               <w:rPr>
-                <w:sz w:val="19"/>
+                <w:sz w:val="18"/>
               </w:rPr>
-              <w:t>Quill.js WYSIWYG rich text editor with embedded HTML sanitization</w:t>
+              <w:t>Reviewer returns memo with comments. Author updates content; system creates MemoVersion snapshot before resubmission.</w:t>
             </w:r>
           </w:p>
         </w:tc>
@@ -878,136 +1539,54 @@
       <w:tr>
         <w:tc>
           <w:tcPr>
-            <w:tcW w:type="dxa" w:w="4680"/>
+            <w:tcW w:type="dxa" w:w="4968"/>
             <w:shd w:fill="F8FAFC"/>
           </w:tcPr>
           <w:p>
             <w:r>
               <w:rPr>
-                <w:sz w:val="19"/>
+                <w:sz w:val="18"/>
               </w:rPr>
-              <w:t>Charts &amp; Visualizations</w:t>
+              <w:t>Final Approval &amp; Seal</w:t>
             </w:r>
           </w:p>
         </w:tc>
         <w:tc>
           <w:tcPr>
-            <w:tcW w:type="dxa" w:w="4680"/>
+            <w:tcW w:type="dxa" w:w="4968"/>
             <w:shd w:fill="F8FAFC"/>
           </w:tcPr>
           <w:p>
             <w:r>
               <w:rPr>
-                <w:sz w:val="19"/>
+                <w:sz w:val="18"/>
               </w:rPr>
-              <w:t>Chart.js for real-time status doughnuts and performance turnaround bars</w:t>
-            </w:r>
-          </w:p>
-        </w:tc>
-      </w:tr>
-      <w:tr>
-        <w:tc>
-          <w:tcPr>
-            <w:tcW w:type="dxa" w:w="4680"/>
-          </w:tcPr>
-          <w:p>
-            <w:r>
-              <w:rPr>
-                <w:sz w:val="19"/>
-              </w:rPr>
-              <w:t>PDF &amp; Document Engine</w:t>
-            </w:r>
-          </w:p>
-        </w:tc>
-        <w:tc>
-          <w:tcPr>
-            <w:tcW w:type="dxa" w:w="4680"/>
-          </w:tcPr>
-          <w:p>
-            <w:r>
-              <w:rPr>
-                <w:sz w:val="19"/>
-              </w:rPr>
-              <w:t>ReportLab &amp; xhtml2pdf with embedded CSS formatting and signature seals</w:t>
-            </w:r>
-          </w:p>
-        </w:tc>
-      </w:tr>
-      <w:tr>
-        <w:tc>
-          <w:tcPr>
-            <w:tcW w:type="dxa" w:w="4680"/>
-            <w:shd w:fill="F8FAFC"/>
-          </w:tcPr>
-          <w:p>
-            <w:r>
-              <w:rPr>
-                <w:sz w:val="19"/>
-              </w:rPr>
-              <w:t>Hosting &amp; Deployment</w:t>
-            </w:r>
-          </w:p>
-        </w:tc>
-        <w:tc>
-          <w:tcPr>
-            <w:tcW w:type="dxa" w:w="4680"/>
-            <w:shd w:fill="F8FAFC"/>
-          </w:tcPr>
-          <w:p>
-            <w:r>
-              <w:rPr>
-                <w:sz w:val="19"/>
-              </w:rPr>
-              <w:t>Vercel Serverless Functions with automated CI/CD pipeline &amp; cache-busting</w:t>
-            </w:r>
-          </w:p>
-        </w:tc>
-      </w:tr>
-      <w:tr>
-        <w:tc>
-          <w:tcPr>
-            <w:tcW w:type="dxa" w:w="4680"/>
-          </w:tcPr>
-          <w:p>
-            <w:r>
-              <w:rPr>
-                <w:sz w:val="19"/>
-              </w:rPr>
-              <w:t>Package Manager &amp; Testing</w:t>
-            </w:r>
-          </w:p>
-        </w:tc>
-        <w:tc>
-          <w:tcPr>
-            <w:tcW w:type="dxa" w:w="4680"/>
-          </w:tcPr>
-          <w:p>
-            <w:r>
-              <w:rPr>
-                <w:sz w:val="19"/>
-              </w:rPr>
-              <w:t>Astral uv package resolver + Pytest test runner (20/20 test suite passing)</w:t>
+              <w:t>Final approver (CEO) marks workflow Approved. System locks content as read-only and generates official signed PDF.</w:t>
             </w:r>
           </w:p>
         </w:tc>
       </w:tr>
     </w:tbl>
+    <w:p/>
     <w:p>
       <w:pPr>
         <w:pStyle w:val="Heading1"/>
       </w:pPr>
       <w:r>
-        <w:t>26.4. System Architecture</w:t>
+        <w:t>7. Security Architecture &amp; Access Control</w:t>
       </w:r>
     </w:p>
     <w:p>
       <w:r>
-        <w:t>The application follows a clean 3-tier decoupled architecture comprising a modern browser SPA, an asynchronous FastAPI REST API backend, and a cloud-native PostgreSQL relational database layer.</w:t>
-      </w:r>
-    </w:p>
-    <w:p>
-      <w:r>
-        <w:t>Architecture Flow: Client Web/Mobile Browser -&gt; FastAPI REST Router Layer -&gt; Core Business Services Layer (Workflow State Machine, Version Service, Audit Engine, Notification Dispatcher, PDF Engine) -&gt; Neon PostgreSQL Cloud Database with Connection Pooling.</w:t>
+        <w:t>• Cryptographic Passwords: Passwords are salted and encrypted using PBKDF2-SHA256 and Bcrypt algorithms.</w:t>
+        <w:br/>
+        <w:t>• JWT Bearer Sessions: Stateless tokens signed with HMAC-SHA256 with 24-hour expiration.</w:t>
+        <w:br/>
+        <w:t>• Admin Self-Protection: Dedicated server-side rules block administrators from deactivating or demoting their own accounts.</w:t>
+        <w:br/>
+        <w:t>• Injection &amp; XSS Defenses: Parameterized queries via SQLAlchemy prevent SQL injection; rich text HTML is sanitized before rendering.</w:t>
+        <w:br/>
+        <w:t>• Secure Cloud Connection: Database connection strictly requires SSL/TLS encryption (sslmode=require).</w:t>
       </w:r>
     </w:p>
     <w:p>
@@ -1015,89 +1594,16 @@
         <w:pStyle w:val="Heading1"/>
       </w:pPr>
       <w:r>
-        <w:t>26.5. Database Design &amp; Multi-Tenancy</w:t>
+        <w:t>8. Known Limitations (Documented Transparently)</w:t>
       </w:r>
     </w:p>
     <w:p>
       <w:r>
-        <w:t>Multi-tenancy is enforced through logical data partitioning with non-nullable foreign keys on all primary tables. Every user, memo, department, category, template, delegation, and audit record is linked to an organization.</w:t>
-      </w:r>
-    </w:p>
-    <w:p>
-      <w:pPr>
-        <w:pStyle w:val="ListBullet"/>
-      </w:pPr>
-      <w:r>
-        <w:t>Primary Relational Entities:</w:t>
-      </w:r>
-    </w:p>
-    <w:p>
-      <w:pPr>
-        <w:pStyle w:val="ListBullet2"/>
-      </w:pPr>
-      <w:r>
-        <w:t>organizations: Master enterprise tenant registry (id, name, code, contact details).</w:t>
-      </w:r>
-    </w:p>
-    <w:p>
-      <w:pPr>
-        <w:pStyle w:val="ListBullet2"/>
-      </w:pPr>
-      <w:r>
-        <w:t>users: Multi-role user accounts (id, org_id, department_id, full_name, email, password_hash, role, is_active).</w:t>
-      </w:r>
-    </w:p>
-    <w:p>
-      <w:pPr>
-        <w:pStyle w:val="ListBullet2"/>
-      </w:pPr>
-      <w:r>
-        <w:t>departments: Functional corporate divisions (id, org_id, name, description).</w:t>
-      </w:r>
-    </w:p>
-    <w:p>
-      <w:pPr>
-        <w:pStyle w:val="ListBullet2"/>
-      </w:pPr>
-      <w:r>
-        <w:t>memos: Core memorandum records (id, org_id, memo_number, title, body_html, priority, status, author_id, current_assignee_id).</w:t>
-      </w:r>
-    </w:p>
-    <w:p>
-      <w:pPr>
-        <w:pStyle w:val="ListBullet2"/>
-      </w:pPr>
-      <w:r>
-        <w:t>memo_workflow_steps: Sequential approval chain stages (id, memo_id, step_number, assigned_user_id, status, decision, comments, action_timestamp).</w:t>
-      </w:r>
-    </w:p>
-    <w:p>
-      <w:pPr>
-        <w:pStyle w:val="ListBullet2"/>
-      </w:pPr>
-      <w:r>
-        <w:t>memo_versions: Historical content snapshots for change requests and revisions.</w:t>
-      </w:r>
-    </w:p>
-    <w:p>
-      <w:pPr>
-        <w:pStyle w:val="ListBullet2"/>
-      </w:pPr>
-      <w:r>
-        <w:t>workflow_delegations: Temporary date-bounded approval authority assignments.</w:t>
-      </w:r>
-    </w:p>
-    <w:p>
-      <w:pPr>
-        <w:pStyle w:val="ListBullet2"/>
-      </w:pPr>
-      <w:r>
-        <w:t>audit_logs: Tamper-evident system activity log with IP addresses and user metadata.</w:t>
-      </w:r>
-    </w:p>
-    <w:p>
-      <w:r>
-        <w:br w:type="page"/>
+        <w:t>1. In-App Notification Transport: Uses responsive client-side HTTP polling rather than full-duplex WebSockets.</w:t>
+        <w:br/>
+        <w:t>2. Object Storage: File attachments are persisted within the PostgreSQL database layer rather than external AWS S3 buckets.</w:t>
+        <w:br/>
+        <w:t>3. Two-Factor Authentication: MFA/TOTP is reserved for future enterprise roadmap versions.</w:t>
       </w:r>
     </w:p>
     <w:p>
@@ -1105,143 +1611,17 @@
         <w:pStyle w:val="Heading1"/>
       </w:pPr>
       <w:r>
-        <w:t>26.6. Workflow &amp; Delegation Design</w:t>
+        <w:t>9. Deployment Information &amp; Demonstration Accounts</w:t>
       </w:r>
     </w:p>
     <w:p>
       <w:r>
-        <w:t>The approval engine operates as a deterministic finite-state machine:</w:t>
-      </w:r>
-    </w:p>
-    <w:p>
-      <w:r>
-        <w:t>1. Submission: A memo begins as Draft and enters Pending Approval at Step 1 upon submission.</w:t>
-      </w:r>
-    </w:p>
-    <w:p>
-      <w:r>
-        <w:t>2. Turn Governance: Only the assigned turn holder (or their authorized delegate) can submit decisions.</w:t>
-      </w:r>
-    </w:p>
-    <w:p>
-      <w:r>
-        <w:t>3. Decision Outcomes: Approving advances the turn to Step N+1; Rejecting permanently terminates the workflow; Requesting Changes returns the memo to the author for revision.</w:t>
-      </w:r>
-    </w:p>
-    <w:p>
-      <w:r>
-        <w:t>4. Mid-Stream Dynamic Injection: Reviewers can use Approve &amp; Add Reviewer to insert specialized reviewers before the next stage.</w:t>
-      </w:r>
-    </w:p>
-    <w:p>
-      <w:r>
-        <w:t>5. Delegation Protocol: If David Vance delegates authority to Jessica Taylor between specified dates, Jessica can execute reviews on David's behalf, with full audit attribution.</w:t>
-      </w:r>
-    </w:p>
-    <w:p>
-      <w:pPr>
-        <w:pStyle w:val="Heading1"/>
-      </w:pPr>
-      <w:r>
-        <w:t>26.7. Security Architecture</w:t>
-      </w:r>
-    </w:p>
-    <w:p>
-      <w:r>
-        <w:t>• Password Security: Passwords are encrypted using strong salted PBKDF2-SHA256 and Bcrypt hashing algorithms.</w:t>
-      </w:r>
-    </w:p>
-    <w:p>
-      <w:r>
-        <w:t>• Stateless JWT: Authentication tokens are digitally signed with HMAC-SHA256 and expire after 24 hours.</w:t>
-      </w:r>
-    </w:p>
-    <w:p>
-      <w:r>
-        <w:t>• Cross-Tenant Protection: API requests validate tenant boundaries; direct cross-tenant entity access throws HTTP 404/403 errors.</w:t>
-      </w:r>
-    </w:p>
-    <w:p>
-      <w:r>
-        <w:t>• Admin Self-Deactivation Guard: Administrators are prevented from deactivating their own accounts or demoting themselves to avoid orphaned tenants.</w:t>
-      </w:r>
-    </w:p>
-    <w:p>
-      <w:r>
-        <w:t>• SQL &amp; XSS Injection Protection: Parameterized queries via SQLAlchemy and HTML sanitization on memo content prevent injection exploits.</w:t>
-      </w:r>
-    </w:p>
-    <w:p>
-      <w:pPr>
-        <w:pStyle w:val="Heading1"/>
-      </w:pPr>
-      <w:r>
-        <w:t>26.8. Vibe-Coding Process &amp; Methodology</w:t>
-      </w:r>
-    </w:p>
-    <w:p>
-      <w:r>
-        <w:t>The development followed an agile Vibe Coding approach with Google Antigravity AI:</w:t>
-      </w:r>
-    </w:p>
-    <w:p>
-      <w:r>
-        <w:t>1. Incremental Modular Prompting: Specifications were broken down into cohesive deliverables (Database models -&gt; Workflow engine -&gt; UI SPA -&gt; PDF export).</w:t>
-      </w:r>
-    </w:p>
-    <w:p>
-      <w:r>
-        <w:t>2. Automated Test Verification: A suite of 20 unit and integration tests was continuously executed via pytest after every code modification.</w:t>
-      </w:r>
-    </w:p>
-    <w:p>
-      <w:r>
-        <w:t>3. Continuous Cloud Deployment: Every git commit automatically deployed to Vercel edge infrastructure for live testing on real mobile and desktop devices.</w:t>
-      </w:r>
-    </w:p>
-    <w:p>
-      <w:pPr>
-        <w:pStyle w:val="Heading1"/>
-      </w:pPr>
-      <w:r>
-        <w:t>26.9. Known Limitations &amp; Future Roadmap</w:t>
-      </w:r>
-    </w:p>
-    <w:p>
-      <w:r>
-        <w:t>• Real-Time WebSocket Push: Notifications currently use responsive client polling; WebSocket channels can be added for instant push delivery.</w:t>
-      </w:r>
-    </w:p>
-    <w:p>
-      <w:r>
-        <w:t>• Cloud Object Storage: File attachments are stored in the database layer; AWS S3 or Cloudflare R2 can be integrated for high-volume enterprise storage.</w:t>
-      </w:r>
-    </w:p>
-    <w:p>
-      <w:pPr>
-        <w:pStyle w:val="Heading1"/>
-      </w:pPr>
-      <w:r>
-        <w:t>26.10. Deployment Information &amp; Evaluation Accounts</w:t>
-      </w:r>
-    </w:p>
-    <w:p>
-      <w:r>
-        <w:t>• Deployed System URL: https://memo-system-pjbj.vercel.app</w:t>
-      </w:r>
-    </w:p>
-    <w:p>
-      <w:r>
+        <w:t>• Live Deployed URL: https://memo-system-pjbj.vercel.app</w:t>
+        <w:br/>
         <w:t>• Source Code ZIP: https://github.com/ZamanShafin/memo-system/raw/main/source_code.zip</w:t>
-      </w:r>
-    </w:p>
-    <w:p>
-      <w:r>
-        <w:t>• Organization Code: acme</w:t>
-      </w:r>
-    </w:p>
-    <w:p>
-      <w:r>
+        <w:br/>
+        <w:t>• Active Organization Code: acme</w:t>
+        <w:br/>
         <w:t>• Universal Password: password123</w:t>
       </w:r>
     </w:p>
@@ -1252,38 +1632,38 @@
         <w:tblLook w:firstColumn="1" w:firstRow="1" w:lastColumn="0" w:lastRow="0" w:noHBand="0" w:noVBand="1" w:val="04A0"/>
       </w:tblPr>
       <w:tblGrid>
-        <w:gridCol w:w="3120"/>
-        <w:gridCol w:w="3120"/>
-        <w:gridCol w:w="3120"/>
+        <w:gridCol w:w="3312"/>
+        <w:gridCol w:w="3312"/>
+        <w:gridCol w:w="3312"/>
       </w:tblGrid>
       <w:tr>
         <w:tc>
           <w:tcPr>
-            <w:tcW w:type="dxa" w:w="3120"/>
-            <w:shd w:fill="1E1B4B"/>
+            <w:tcW w:type="dxa" w:w="3312"/>
+            <w:shd w:fill="312E81"/>
           </w:tcPr>
           <w:p>
             <w:r>
               <w:rPr>
                 <w:b/>
                 <w:color w:val="FFFFFF"/>
-                <w:sz w:val="20"/>
+                <w:sz w:val="19"/>
               </w:rPr>
-              <w:t>Role / Persona</w:t>
+              <w:t>Role</w:t>
             </w:r>
           </w:p>
         </w:tc>
         <w:tc>
           <w:tcPr>
-            <w:tcW w:type="dxa" w:w="3120"/>
-            <w:shd w:fill="1E1B4B"/>
+            <w:tcW w:type="dxa" w:w="3312"/>
+            <w:shd w:fill="312E81"/>
           </w:tcPr>
           <w:p>
             <w:r>
               <w:rPr>
                 <w:b/>
                 <w:color w:val="FFFFFF"/>
-                <w:sz w:val="20"/>
+                <w:sz w:val="19"/>
               </w:rPr>
               <w:t>Login Email</w:t>
             </w:r>
@@ -1291,17 +1671,17 @@
         </w:tc>
         <w:tc>
           <w:tcPr>
-            <w:tcW w:type="dxa" w:w="3120"/>
-            <w:shd w:fill="1E1B4B"/>
+            <w:tcW w:type="dxa" w:w="3312"/>
+            <w:shd w:fill="312E81"/>
           </w:tcPr>
           <w:p>
             <w:r>
               <w:rPr>
                 <w:b/>
                 <w:color w:val="FFFFFF"/>
-                <w:sz w:val="20"/>
+                <w:sz w:val="19"/>
               </w:rPr>
-              <w:t>Department / Role</w:t>
+              <w:t>Persona / Purpose</w:t>
             </w:r>
           </w:p>
         </w:tc>
@@ -1309,27 +1689,27 @@
       <w:tr>
         <w:tc>
           <w:tcPr>
-            <w:tcW w:type="dxa" w:w="3120"/>
+            <w:tcW w:type="dxa" w:w="3312"/>
             <w:shd w:fill="F8FAFC"/>
           </w:tcPr>
           <w:p>
             <w:r>
               <w:rPr>
-                <w:sz w:val="19"/>
+                <w:sz w:val="18"/>
               </w:rPr>
-              <w:t>System Administrator</w:t>
+              <w:t>Admin</w:t>
             </w:r>
           </w:p>
         </w:tc>
         <w:tc>
           <w:tcPr>
-            <w:tcW w:type="dxa" w:w="3120"/>
+            <w:tcW w:type="dxa" w:w="3312"/>
             <w:shd w:fill="F8FAFC"/>
           </w:tcPr>
           <w:p>
             <w:r>
               <w:rPr>
-                <w:sz w:val="19"/>
+                <w:sz w:val="18"/>
               </w:rPr>
               <w:t>admin@acmecorp.com</w:t>
             </w:r>
@@ -1337,15 +1717,15 @@
         </w:tc>
         <w:tc>
           <w:tcPr>
-            <w:tcW w:type="dxa" w:w="3120"/>
+            <w:tcW w:type="dxa" w:w="3312"/>
             <w:shd w:fill="F8FAFC"/>
           </w:tcPr>
           <w:p>
             <w:r>
               <w:rPr>
-                <w:sz w:val="19"/>
+                <w:sz w:val="18"/>
               </w:rPr>
-              <w:t>Executive Operations (Admin)</w:t>
+              <w:t>Sarah Jenkins (System Administrator)</w:t>
             </w:r>
           </w:p>
         </w:tc>
@@ -1353,25 +1733,25 @@
       <w:tr>
         <w:tc>
           <w:tcPr>
-            <w:tcW w:type="dxa" w:w="3120"/>
+            <w:tcW w:type="dxa" w:w="3312"/>
           </w:tcPr>
           <w:p>
             <w:r>
               <w:rPr>
-                <w:sz w:val="19"/>
+                <w:sz w:val="18"/>
               </w:rPr>
-              <w:t>Requester / Author</w:t>
+              <w:t>Author</w:t>
             </w:r>
           </w:p>
         </w:tc>
         <w:tc>
           <w:tcPr>
-            <w:tcW w:type="dxa" w:w="3120"/>
+            <w:tcW w:type="dxa" w:w="3312"/>
           </w:tcPr>
           <w:p>
             <w:r>
               <w:rPr>
-                <w:sz w:val="19"/>
+                <w:sz w:val="18"/>
               </w:rPr>
               <w:t>alex.morgan@acmecorp.com</w:t>
             </w:r>
@@ -1379,14 +1759,14 @@
         </w:tc>
         <w:tc>
           <w:tcPr>
-            <w:tcW w:type="dxa" w:w="3120"/>
+            <w:tcW w:type="dxa" w:w="3312"/>
           </w:tcPr>
           <w:p>
             <w:r>
               <w:rPr>
-                <w:sz w:val="19"/>
+                <w:sz w:val="18"/>
               </w:rPr>
-              <w:t>Engineering &amp; Technology (User)</w:t>
+              <w:t>Alex Morgan (Senior Engineer / Author)</w:t>
             </w:r>
           </w:p>
         </w:tc>
@@ -1394,27 +1774,27 @@
       <w:tr>
         <w:tc>
           <w:tcPr>
-            <w:tcW w:type="dxa" w:w="3120"/>
+            <w:tcW w:type="dxa" w:w="3312"/>
             <w:shd w:fill="F8FAFC"/>
           </w:tcPr>
           <w:p>
             <w:r>
               <w:rPr>
-                <w:sz w:val="19"/>
+                <w:sz w:val="18"/>
               </w:rPr>
-              <w:t>Department Head</w:t>
+              <w:t>Dept Head</w:t>
             </w:r>
           </w:p>
         </w:tc>
         <w:tc>
           <w:tcPr>
-            <w:tcW w:type="dxa" w:w="3120"/>
+            <w:tcW w:type="dxa" w:w="3312"/>
             <w:shd w:fill="F8FAFC"/>
           </w:tcPr>
           <w:p>
             <w:r>
               <w:rPr>
-                <w:sz w:val="19"/>
+                <w:sz w:val="18"/>
               </w:rPr>
               <w:t>head.eng@acmecorp.com</w:t>
             </w:r>
@@ -1422,15 +1802,15 @@
         </w:tc>
         <w:tc>
           <w:tcPr>
-            <w:tcW w:type="dxa" w:w="3120"/>
+            <w:tcW w:type="dxa" w:w="3312"/>
             <w:shd w:fill="F8FAFC"/>
           </w:tcPr>
           <w:p>
             <w:r>
               <w:rPr>
-                <w:sz w:val="19"/>
+                <w:sz w:val="18"/>
               </w:rPr>
-              <w:t>Engineering &amp; Technology (User)</w:t>
+              <w:t>David Vance (VP of Engineering / Approver)</w:t>
             </w:r>
           </w:p>
         </w:tc>
@@ -1438,25 +1818,25 @@
       <w:tr>
         <w:tc>
           <w:tcPr>
-            <w:tcW w:type="dxa" w:w="3120"/>
+            <w:tcW w:type="dxa" w:w="3312"/>
           </w:tcPr>
           <w:p>
             <w:r>
               <w:rPr>
-                <w:sz w:val="19"/>
+                <w:sz w:val="18"/>
               </w:rPr>
-              <w:t>Acting Delegate</w:t>
+              <w:t>Delegate</w:t>
             </w:r>
           </w:p>
         </w:tc>
         <w:tc>
           <w:tcPr>
-            <w:tcW w:type="dxa" w:w="3120"/>
+            <w:tcW w:type="dxa" w:w="3312"/>
           </w:tcPr>
           <w:p>
             <w:r>
               <w:rPr>
-                <w:sz w:val="19"/>
+                <w:sz w:val="18"/>
               </w:rPr>
               <w:t>jessica.taylor@acmecorp.com</w:t>
             </w:r>
@@ -1464,14 +1844,14 @@
         </w:tc>
         <w:tc>
           <w:tcPr>
-            <w:tcW w:type="dxa" w:w="3120"/>
+            <w:tcW w:type="dxa" w:w="3312"/>
           </w:tcPr>
           <w:p>
             <w:r>
               <w:rPr>
-                <w:sz w:val="19"/>
+                <w:sz w:val="18"/>
               </w:rPr>
-              <w:t>Engineering &amp; Technology (User)</w:t>
+              <w:t>Jessica Taylor (Acting Delegate for David)</w:t>
             </w:r>
           </w:p>
         </w:tc>
@@ -1479,27 +1859,27 @@
       <w:tr>
         <w:tc>
           <w:tcPr>
-            <w:tcW w:type="dxa" w:w="3120"/>
+            <w:tcW w:type="dxa" w:w="3312"/>
             <w:shd w:fill="F8FAFC"/>
           </w:tcPr>
           <w:p>
             <w:r>
               <w:rPr>
-                <w:sz w:val="19"/>
+                <w:sz w:val="18"/>
               </w:rPr>
-              <w:t>Finance Manager</w:t>
+              <w:t>Finance</w:t>
             </w:r>
           </w:p>
         </w:tc>
         <w:tc>
           <w:tcPr>
-            <w:tcW w:type="dxa" w:w="3120"/>
+            <w:tcW w:type="dxa" w:w="3312"/>
             <w:shd w:fill="F8FAFC"/>
           </w:tcPr>
           <w:p>
             <w:r>
               <w:rPr>
-                <w:sz w:val="19"/>
+                <w:sz w:val="18"/>
               </w:rPr>
               <w:t>finance.mgr@acmecorp.com</w:t>
             </w:r>
@@ -1507,15 +1887,15 @@
         </w:tc>
         <w:tc>
           <w:tcPr>
-            <w:tcW w:type="dxa" w:w="3120"/>
+            <w:tcW w:type="dxa" w:w="3312"/>
             <w:shd w:fill="F8FAFC"/>
           </w:tcPr>
           <w:p>
             <w:r>
               <w:rPr>
-                <w:sz w:val="19"/>
+                <w:sz w:val="18"/>
               </w:rPr>
-              <w:t>Finance &amp; Accounts (User)</w:t>
+              <w:t>Rachel Green (Chief Financial Manager)</w:t>
             </w:r>
           </w:p>
         </w:tc>
@@ -1523,25 +1903,25 @@
       <w:tr>
         <w:tc>
           <w:tcPr>
-            <w:tcW w:type="dxa" w:w="3120"/>
+            <w:tcW w:type="dxa" w:w="3312"/>
           </w:tcPr>
           <w:p>
             <w:r>
               <w:rPr>
-                <w:sz w:val="19"/>
+                <w:sz w:val="18"/>
               </w:rPr>
-              <w:t>Director of Operations</w:t>
+              <w:t>Director</w:t>
             </w:r>
           </w:p>
         </w:tc>
         <w:tc>
           <w:tcPr>
-            <w:tcW w:type="dxa" w:w="3120"/>
+            <w:tcW w:type="dxa" w:w="3312"/>
           </w:tcPr>
           <w:p>
             <w:r>
               <w:rPr>
-                <w:sz w:val="19"/>
+                <w:sz w:val="18"/>
               </w:rPr>
               <w:t>director@acmecorp.com</w:t>
             </w:r>
@@ -1549,14 +1929,14 @@
         </w:tc>
         <w:tc>
           <w:tcPr>
-            <w:tcW w:type="dxa" w:w="3120"/>
+            <w:tcW w:type="dxa" w:w="3312"/>
           </w:tcPr>
           <w:p>
             <w:r>
               <w:rPr>
-                <w:sz w:val="19"/>
+                <w:sz w:val="18"/>
               </w:rPr>
-              <w:t>Procurement &amp; Operations (User)</w:t>
+              <w:t>Marcus Sterling (Director of Operations)</w:t>
             </w:r>
           </w:p>
         </w:tc>
@@ -1564,27 +1944,27 @@
       <w:tr>
         <w:tc>
           <w:tcPr>
-            <w:tcW w:type="dxa" w:w="3120"/>
+            <w:tcW w:type="dxa" w:w="3312"/>
             <w:shd w:fill="F8FAFC"/>
           </w:tcPr>
           <w:p>
             <w:r>
               <w:rPr>
-                <w:sz w:val="19"/>
+                <w:sz w:val="18"/>
               </w:rPr>
-              <w:t>Chief Executive Officer</w:t>
+              <w:t>CEO</w:t>
             </w:r>
           </w:p>
         </w:tc>
         <w:tc>
           <w:tcPr>
-            <w:tcW w:type="dxa" w:w="3120"/>
+            <w:tcW w:type="dxa" w:w="3312"/>
             <w:shd w:fill="F8FAFC"/>
           </w:tcPr>
           <w:p>
             <w:r>
               <w:rPr>
-                <w:sz w:val="19"/>
+                <w:sz w:val="18"/>
               </w:rPr>
               <w:t>ceo@acmecorp.com</w:t>
             </w:r>
@@ -1592,15 +1972,15 @@
         </w:tc>
         <w:tc>
           <w:tcPr>
-            <w:tcW w:type="dxa" w:w="3120"/>
+            <w:tcW w:type="dxa" w:w="3312"/>
             <w:shd w:fill="F8FAFC"/>
           </w:tcPr>
           <w:p>
             <w:r>
               <w:rPr>
-                <w:sz w:val="19"/>
+                <w:sz w:val="18"/>
               </w:rPr>
-              <w:t>Executive Office (User)</w:t>
+              <w:t>Eleanor Vance (Chief Executive Officer)</w:t>
             </w:r>
           </w:p>
         </w:tc>
@@ -1608,7 +1988,7 @@
     </w:tbl>
     <w:sectPr>
       <w:pgSz w:w="12240" w:h="15840"/>
-      <w:pgMar w:top="1440" w:right="1440" w:bottom="1440" w:left="1440" w:header="720" w:footer="720" w:gutter="0"/>
+      <w:pgMar w:top="1152" w:right="1152" w:bottom="1152" w:left="1152" w:header="720" w:footer="720" w:gutter="0"/>
       <w:cols w:space="720"/>
       <w:docGrid w:linePitch="360"/>
     </w:sectPr>

</xml_diff>

<commit_message>
docs: synchronize final_submission/PROJECT_DOCUMENTATION.md with exact student metadata, TOC, system architecture diagram, and workflow state transition diagram
</commit_message>
<xml_diff>
--- a/PROJECT_DOCUMENTATION.docx
+++ b/PROJECT_DOCUMENTATION.docx
@@ -26,6 +26,7 @@
         <w:t>Deterministic Sequential Approval Workflow Engine &amp; Document Governance SaaS</w:t>
       </w:r>
     </w:p>
+    <w:p/>
     <w:tbl>
       <w:tblPr>
         <w:tblW w:type="auto" w:w="0"/>
@@ -39,29 +40,29 @@
       <w:tr>
         <w:tc>
           <w:tcPr>
-            <w:tcW w:type="dxa" w:w="2880"/>
+            <w:tcW w:type="dxa" w:w="3168"/>
             <w:shd w:fill="F1F5F9"/>
           </w:tcPr>
           <w:p>
             <w:r>
               <w:rPr>
                 <w:b/>
-                <w:sz w:val="19"/>
+                <w:sz w:val="20"/>
               </w:rPr>
-              <w:t>Author / Student:</w:t>
+              <w:t>Name:</w:t>
             </w:r>
           </w:p>
         </w:tc>
         <w:tc>
           <w:tcPr>
-            <w:tcW w:type="dxa" w:w="6912"/>
+            <w:tcW w:type="dxa" w:w="6624"/>
           </w:tcPr>
           <w:p>
             <w:r>
               <w:rPr>
-                <w:sz w:val="19"/>
+                <w:sz w:val="20"/>
               </w:rPr>
-              <w:t>Zaman Shafin (North South University)</w:t>
+              <w:t>M.N. Zaman Shafin</w:t>
             </w:r>
           </w:p>
         </w:tc>
@@ -69,29 +70,29 @@
       <w:tr>
         <w:tc>
           <w:tcPr>
-            <w:tcW w:type="dxa" w:w="2880"/>
+            <w:tcW w:type="dxa" w:w="3168"/>
             <w:shd w:fill="F1F5F9"/>
           </w:tcPr>
           <w:p>
             <w:r>
               <w:rPr>
                 <w:b/>
-                <w:sz w:val="19"/>
+                <w:sz w:val="20"/>
               </w:rPr>
-              <w:t>Course &amp; Term:</w:t>
+              <w:t>ID:</w:t>
             </w:r>
           </w:p>
         </w:tc>
         <w:tc>
           <w:tcPr>
-            <w:tcW w:type="dxa" w:w="6912"/>
+            <w:tcW w:type="dxa" w:w="6624"/>
           </w:tcPr>
           <w:p>
             <w:r>
               <w:rPr>
-                <w:sz w:val="19"/>
+                <w:sz w:val="20"/>
               </w:rPr>
-              <w:t>CSE226 Foundations of Vibe Coding — Summer 2026</w:t>
+              <w:t>2232299030</w:t>
             </w:r>
           </w:p>
         </w:tc>
@@ -99,14 +100,44 @@
       <w:tr>
         <w:tc>
           <w:tcPr>
-            <w:tcW w:type="dxa" w:w="2880"/>
+            <w:tcW w:type="dxa" w:w="3168"/>
             <w:shd w:fill="F1F5F9"/>
           </w:tcPr>
           <w:p>
             <w:r>
               <w:rPr>
                 <w:b/>
-                <w:sz w:val="19"/>
+                <w:sz w:val="20"/>
+              </w:rPr>
+              <w:t>Course &amp; Semester:</w:t>
+            </w:r>
+          </w:p>
+        </w:tc>
+        <w:tc>
+          <w:tcPr>
+            <w:tcW w:type="dxa" w:w="6624"/>
+          </w:tcPr>
+          <w:p>
+            <w:r>
+              <w:rPr>
+                <w:sz w:val="20"/>
+              </w:rPr>
+              <w:t>CSE226 Foundations of Vibe Coding - Summer 2026</w:t>
+            </w:r>
+          </w:p>
+        </w:tc>
+      </w:tr>
+      <w:tr>
+        <w:tc>
+          <w:tcPr>
+            <w:tcW w:type="dxa" w:w="3168"/>
+            <w:shd w:fill="F1F5F9"/>
+          </w:tcPr>
+          <w:p>
+            <w:r>
+              <w:rPr>
+                <w:b/>
+                <w:sz w:val="20"/>
               </w:rPr>
               <w:t>Deployed System URL:</w:t>
             </w:r>
@@ -114,12 +145,12 @@
         </w:tc>
         <w:tc>
           <w:tcPr>
-            <w:tcW w:type="dxa" w:w="6912"/>
+            <w:tcW w:type="dxa" w:w="6624"/>
           </w:tcPr>
           <w:p>
             <w:r>
               <w:rPr>
-                <w:sz w:val="19"/>
+                <w:sz w:val="20"/>
               </w:rPr>
               <w:t>https://memo-system-pjbj.vercel.app</w:t>
             </w:r>
@@ -129,14 +160,14 @@
       <w:tr>
         <w:tc>
           <w:tcPr>
-            <w:tcW w:type="dxa" w:w="2880"/>
+            <w:tcW w:type="dxa" w:w="3168"/>
             <w:shd w:fill="F1F5F9"/>
           </w:tcPr>
           <w:p>
             <w:r>
               <w:rPr>
                 <w:b/>
-                <w:sz w:val="19"/>
+                <w:sz w:val="20"/>
               </w:rPr>
               <w:t>Source Code Archive:</w:t>
             </w:r>
@@ -144,12 +175,12 @@
         </w:tc>
         <w:tc>
           <w:tcPr>
-            <w:tcW w:type="dxa" w:w="6912"/>
+            <w:tcW w:type="dxa" w:w="6624"/>
           </w:tcPr>
           <w:p>
             <w:r>
               <w:rPr>
-                <w:sz w:val="19"/>
+                <w:sz w:val="20"/>
               </w:rPr>
               <w:t>https://github.com/ZamanShafin/memo-system/raw/main/source_code.zip</w:t>
             </w:r>
@@ -159,14 +190,14 @@
       <w:tr>
         <w:tc>
           <w:tcPr>
-            <w:tcW w:type="dxa" w:w="2880"/>
+            <w:tcW w:type="dxa" w:w="3168"/>
             <w:shd w:fill="F1F5F9"/>
           </w:tcPr>
           <w:p>
             <w:r>
               <w:rPr>
                 <w:b/>
-                <w:sz w:val="19"/>
+                <w:sz w:val="20"/>
               </w:rPr>
               <w:t>GitHub Repository:</w:t>
             </w:r>
@@ -174,12 +205,12 @@
         </w:tc>
         <w:tc>
           <w:tcPr>
-            <w:tcW w:type="dxa" w:w="6912"/>
+            <w:tcW w:type="dxa" w:w="6624"/>
           </w:tcPr>
           <w:p>
             <w:r>
               <w:rPr>
-                <w:sz w:val="19"/>
+                <w:sz w:val="20"/>
               </w:rPr>
               <w:t>https://github.com/ZamanShafin/memo-system</w:t>
             </w:r>
@@ -187,7 +218,237 @@
         </w:tc>
       </w:tr>
     </w:tbl>
-    <w:p/>
+    <w:p>
+      <w:r>
+        <w:br w:type="page"/>
+      </w:r>
+    </w:p>
+    <w:p>
+      <w:pPr>
+        <w:jc w:val="center"/>
+      </w:pPr>
+      <w:r>
+        <w:rPr>
+          <w:b/>
+          <w:color w:val="1E1B4B"/>
+          <w:sz w:val="32"/>
+        </w:rPr>
+        <w:t>Table of Contents</w:t>
+        <w:br/>
+      </w:r>
+    </w:p>
+    <w:p>
+      <w:pPr>
+        <w:spacing w:line="312" w:lineRule="auto"/>
+      </w:pPr>
+      <w:r>
+        <w:rPr>
+          <w:sz w:val="20"/>
+        </w:rPr>
+        <w:t>1. System Overview &amp; Core Capabilities</w:t>
+      </w:r>
+      <w:r>
+        <w:rPr>
+          <w:color w:val="94A3B8"/>
+        </w:rPr>
+        <w:t xml:space="preserve">  .  .  .  .  .  .  .  .  .  .  .  </w:t>
+      </w:r>
+      <w:r>
+        <w:rPr>
+          <w:b/>
+        </w:rPr>
+        <w:t xml:space="preserve"> 3</w:t>
+      </w:r>
+    </w:p>
+    <w:p>
+      <w:pPr>
+        <w:spacing w:line="312" w:lineRule="auto"/>
+      </w:pPr>
+      <w:r>
+        <w:rPr>
+          <w:sz w:val="20"/>
+        </w:rPr>
+        <w:t>2. Requirements Implemented (Compliance Matrix)</w:t>
+      </w:r>
+      <w:r>
+        <w:rPr>
+          <w:color w:val="94A3B8"/>
+        </w:rPr>
+        <w:t xml:space="preserve">  .  .  .  .  .  .  .  .  </w:t>
+      </w:r>
+      <w:r>
+        <w:rPr>
+          <w:b/>
+        </w:rPr>
+        <w:t xml:space="preserve"> 3</w:t>
+      </w:r>
+    </w:p>
+    <w:p>
+      <w:pPr>
+        <w:spacing w:line="312" w:lineRule="auto"/>
+      </w:pPr>
+      <w:r>
+        <w:rPr>
+          <w:sz w:val="20"/>
+        </w:rPr>
+        <w:t>3. Technology Stack</w:t>
+      </w:r>
+      <w:r>
+        <w:rPr>
+          <w:color w:val="94A3B8"/>
+        </w:rPr>
+        <w:t xml:space="preserve">  .  .  .  .  .  .  .  .  .  .  .  .  .  .  .  .  .  </w:t>
+      </w:r>
+      <w:r>
+        <w:rPr>
+          <w:b/>
+        </w:rPr>
+        <w:t xml:space="preserve"> 4</w:t>
+      </w:r>
+    </w:p>
+    <w:p>
+      <w:pPr>
+        <w:spacing w:line="312" w:lineRule="auto"/>
+      </w:pPr>
+      <w:r>
+        <w:rPr>
+          <w:sz w:val="20"/>
+        </w:rPr>
+        <w:t>4. System Architecture &amp; Diagram</w:t>
+      </w:r>
+      <w:r>
+        <w:rPr>
+          <w:color w:val="94A3B8"/>
+        </w:rPr>
+        <w:t xml:space="preserve">  .  .  .  .  .  .  .  .  .  .  .  .  .  </w:t>
+      </w:r>
+      <w:r>
+        <w:rPr>
+          <w:b/>
+        </w:rPr>
+        <w:t xml:space="preserve"> 6</w:t>
+      </w:r>
+    </w:p>
+    <w:p>
+      <w:pPr>
+        <w:spacing w:line="312" w:lineRule="auto"/>
+      </w:pPr>
+      <w:r>
+        <w:rPr>
+          <w:sz w:val="20"/>
+        </w:rPr>
+        <w:t>5. Database Design &amp; Multi-Tenancy Enforcement</w:t>
+      </w:r>
+      <w:r>
+        <w:rPr>
+          <w:color w:val="94A3B8"/>
+        </w:rPr>
+        <w:t xml:space="preserve">  .  .  .  .  .  .  .  .  .  </w:t>
+      </w:r>
+      <w:r>
+        <w:rPr>
+          <w:b/>
+        </w:rPr>
+        <w:t xml:space="preserve"> 7</w:t>
+      </w:r>
+    </w:p>
+    <w:p>
+      <w:pPr>
+        <w:spacing w:line="312" w:lineRule="auto"/>
+      </w:pPr>
+      <w:r>
+        <w:rPr>
+          <w:sz w:val="20"/>
+        </w:rPr>
+        <w:t>6. Sequential Workflow Design &amp; Turn Governance</w:t>
+      </w:r>
+      <w:r>
+        <w:rPr>
+          <w:color w:val="94A3B8"/>
+        </w:rPr>
+        <w:t xml:space="preserve">  .  .  .  .  .  .  .  .  </w:t>
+      </w:r>
+      <w:r>
+        <w:rPr>
+          <w:b/>
+        </w:rPr>
+        <w:t xml:space="preserve"> 8</w:t>
+      </w:r>
+    </w:p>
+    <w:p>
+      <w:pPr>
+        <w:spacing w:line="312" w:lineRule="auto"/>
+      </w:pPr>
+      <w:r>
+        <w:rPr>
+          <w:sz w:val="20"/>
+        </w:rPr>
+        <w:t>7. Security Architecture &amp; Access Control</w:t>
+      </w:r>
+      <w:r>
+        <w:rPr>
+          <w:color w:val="94A3B8"/>
+        </w:rPr>
+        <w:t xml:space="preserve">  .  .  .  .  .  .  .  .  .  .  </w:t>
+      </w:r>
+      <w:r>
+        <w:rPr>
+          <w:b/>
+        </w:rPr>
+        <w:t xml:space="preserve"> 10</w:t>
+      </w:r>
+    </w:p>
+    <w:p>
+      <w:pPr>
+        <w:spacing w:line="312" w:lineRule="auto"/>
+      </w:pPr>
+      <w:r>
+        <w:rPr>
+          <w:sz w:val="20"/>
+        </w:rPr>
+        <w:t>8. Known Limitations</w:t>
+      </w:r>
+      <w:r>
+        <w:rPr>
+          <w:color w:val="94A3B8"/>
+        </w:rPr>
+        <w:t xml:space="preserve">  .  .  .  .  .  .  .  .  .  .  .  .  .  .  .  .  .  </w:t>
+      </w:r>
+      <w:r>
+        <w:rPr>
+          <w:b/>
+        </w:rPr>
+        <w:t xml:space="preserve"> 10</w:t>
+      </w:r>
+    </w:p>
+    <w:p>
+      <w:pPr>
+        <w:spacing w:line="312" w:lineRule="auto"/>
+      </w:pPr>
+      <w:r>
+        <w:rPr>
+          <w:sz w:val="20"/>
+        </w:rPr>
+        <w:t>9. Deployment Information &amp; Demonstration Accounts</w:t>
+      </w:r>
+      <w:r>
+        <w:rPr>
+          <w:color w:val="94A3B8"/>
+        </w:rPr>
+        <w:t xml:space="preserve">  .  .  .  .  .  .  .  .  </w:t>
+      </w:r>
+      <w:r>
+        <w:rPr>
+          <w:b/>
+        </w:rPr>
+        <w:t xml:space="preserve"> 10</w:t>
+      </w:r>
+    </w:p>
+    <w:p>
+      <w:r>
+        <w:br w:type="page"/>
+      </w:r>
+    </w:p>
     <w:p>
       <w:pPr>
         <w:pStyle w:val="Heading1"/>
@@ -234,17 +495,17 @@
                 <w:color w:val="334155"/>
                 <w:sz w:val="19"/>
               </w:rPr>
-              <w:t>• Multi-Tenant Isolation: Logical data partitioning with non-nullable org_id scoping across every database query.</w:t>
+              <w:t>? Multi-Tenant Isolation: Logical data partitioning with non-nullable org_id scoping across every database query.</w:t>
               <w:br/>
-              <w:t>• Strict Turn Governance: Memos execute sequentially (Requester -&gt; Dept Head -&gt; Finance -&gt; Director -&gt; CEO). Later participants are physically blocked from acting early.</w:t>
+              <w:t>? Strict Turn Governance: Memos execute sequentially (Requester -&gt; Dept Head -&gt; Finance -&gt; Director -&gt; CEO). Later participants are physically blocked from acting early.</w:t>
               <w:br/>
-              <w:t>• Active Delegation: Temporary date-bounded approval authority handoffs when officers are on leave.</w:t>
+              <w:t>? Active Delegation: Temporary date-bounded approval authority handoffs when officers are on leave.</w:t>
               <w:br/>
-              <w:t>• Dynamic Reviewer Injection: Approvers can dynamically insert specialized reviewers (e.g. Legal Counsel) mid-stream.</w:t>
+              <w:t>? Dynamic Reviewer Injection: Approvers can dynamically insert specialized reviewers (e.g. Legal Counsel) mid-stream.</w:t>
               <w:br/>
-              <w:t>• Tamper-Evident Auditing: Append-only audit logs with timestamps, actor IDs, comments, and client IPs.</w:t>
+              <w:t>? Tamper-Evident Auditing: Append-only audit logs with timestamps, actor IDs, comments, and client IPs.</w:t>
               <w:br/>
-              <w:t>• PDF Seal Engine: Generates official corporate PDFs complete with digital signatures and QR verification codes.</w:t>
+              <w:t>? PDF Seal Engine: Generates official corporate PDFs complete with digital signatures and QR verification codes.</w:t>
             </w:r>
           </w:p>
         </w:tc>
@@ -620,7 +881,11 @@
         </w:tc>
       </w:tr>
     </w:tbl>
-    <w:p/>
+    <w:p>
+      <w:r>
+        <w:br w:type="page"/>
+      </w:r>
+    </w:p>
     <w:p>
       <w:pPr>
         <w:pStyle w:val="Heading1"/>
@@ -1104,8 +1369,11 @@
       </w:r>
     </w:p>
     <w:p>
+      <w:pPr>
+        <w:pStyle w:val="ListBullet"/>
+      </w:pPr>
       <w:r>
-        <w:t>Multi-tenancy is enforced through strict logical data partitioning. Every single table in the database contains a non-nullable foreign key referencing organizations.id. Multi-tenancy is guaranteed at the database and API layer through the following mechanisms:</w:t>
+        <w:t>? Server-Side Query Scoping: Every database query in all routers automatically includes models.Entity.org_id == current_user.org_id. Client-side filtering is never relied upon for security.</w:t>
       </w:r>
     </w:p>
     <w:p>
@@ -1113,7 +1381,7 @@
         <w:pStyle w:val="ListBullet"/>
       </w:pPr>
       <w:r>
-        <w:t>• Server-Side Query Scoping: Every database query in all routers automatically includes models.Entity.org_id == current_user.org_id. Client-side filtering is never relied upon for security.</w:t>
+        <w:t>? Direct Object Access Validation: When accessing a resource by ID (e.g. GET /memos/10), the server verifies memo.org_id == current_user.org_id. If the tenant IDs mismatch, an immediate HTTP 404/403 is thrown.</w:t>
       </w:r>
     </w:p>
     <w:p>
@@ -1121,15 +1389,7 @@
         <w:pStyle w:val="ListBullet"/>
       </w:pPr>
       <w:r>
-        <w:t>• Direct Object Access Validation: When accessing a resource by ID (e.g. GET /memos/10), the server verifies memo.org_id == current_user.org_id. If the tenant IDs mismatch, an immediate HTTP 404/403 is thrown.</w:t>
-      </w:r>
-    </w:p>
-    <w:p>
-      <w:pPr>
-        <w:pStyle w:val="ListBullet"/>
-      </w:pPr>
-      <w:r>
-        <w:t>• Cascade Isolation: Deleting or modifying a department, user, or workflow step is strictly constrained to the user's organization.</w:t>
+        <w:t>? Cascade Isolation: Deleting or modifying a department, user, or workflow step is strictly constrained to the user's organization.</w:t>
       </w:r>
     </w:p>
     <w:tbl>
@@ -1567,7 +1827,11 @@
         </w:tc>
       </w:tr>
     </w:tbl>
-    <w:p/>
+    <w:p>
+      <w:r>
+        <w:br w:type="page"/>
+      </w:r>
+    </w:p>
     <w:p>
       <w:pPr>
         <w:pStyle w:val="Heading1"/>
@@ -1578,15 +1842,15 @@
     </w:p>
     <w:p>
       <w:r>
-        <w:t>• Cryptographic Passwords: Passwords are salted and encrypted using PBKDF2-SHA256 and Bcrypt algorithms.</w:t>
+        <w:t>? Cryptographic Passwords: Passwords are salted and encrypted using PBKDF2-SHA256 and Bcrypt algorithms.</w:t>
         <w:br/>
-        <w:t>• JWT Bearer Sessions: Stateless tokens signed with HMAC-SHA256 with 24-hour expiration.</w:t>
+        <w:t>? JWT Bearer Sessions: Stateless tokens signed with HMAC-SHA256 with 24-hour expiration.</w:t>
         <w:br/>
-        <w:t>• Admin Self-Protection: Dedicated server-side rules block administrators from deactivating or demoting their own accounts.</w:t>
+        <w:t>? Admin Self-Protection: Dedicated server-side rules block administrators from deactivating or demoting their own accounts.</w:t>
         <w:br/>
-        <w:t>• Injection &amp; XSS Defenses: Parameterized queries via SQLAlchemy prevent SQL injection; rich text HTML is sanitized before rendering.</w:t>
+        <w:t>? Injection &amp; XSS Defenses: Parameterized queries via SQLAlchemy prevent SQL injection; rich text HTML is sanitized before rendering.</w:t>
         <w:br/>
-        <w:t>• Secure Cloud Connection: Database connection strictly requires SSL/TLS encryption (sslmode=require).</w:t>
+        <w:t>? Secure Cloud Connection: Database connection strictly requires SSL/TLS encryption (sslmode=require).</w:t>
       </w:r>
     </w:p>
     <w:p>
@@ -1594,7 +1858,7 @@
         <w:pStyle w:val="Heading1"/>
       </w:pPr>
       <w:r>
-        <w:t>8. Known Limitations (Documented Transparently)</w:t>
+        <w:t>8. Known Limitations</w:t>
       </w:r>
     </w:p>
     <w:p>
@@ -1616,13 +1880,13 @@
     </w:p>
     <w:p>
       <w:r>
-        <w:t>• Live Deployed URL: https://memo-system-pjbj.vercel.app</w:t>
+        <w:t>? Live Deployed URL: https://memo-system-pjbj.vercel.app</w:t>
         <w:br/>
-        <w:t>• Source Code ZIP: https://github.com/ZamanShafin/memo-system/raw/main/source_code.zip</w:t>
+        <w:t>? Source Code ZIP: https://github.com/ZamanShafin/memo-system/raw/main/source_code.zip</w:t>
         <w:br/>
-        <w:t>• Active Organization Code: acme</w:t>
+        <w:t>? Active Organization Code: acme</w:t>
         <w:br/>
-        <w:t>• Universal Password: password123</w:t>
+        <w:t>? Universal Password: password123</w:t>
       </w:r>
     </w:p>
     <w:tbl>

</xml_diff>